<commit_message>
Upload do Relatorio Final da Segunda Iteração
</commit_message>
<xml_diff>
--- a/Documentation/Iteration02/Relatório_Segunda_Iteração.docx
+++ b/Documentation/Iteration02/Relatório_Segunda_Iteração.docx
@@ -548,8 +548,8 @@
           <w:smallCaps w:val="0"/>
           <w:strike w:val="0"/>
           <w:color w:val="000000"/>
-          <w:sz w:val="20"/>
-          <w:szCs w:val="20"/>
+          <w:sz w:val="24"/>
+          <w:szCs w:val="24"/>
           <w:u w:val="none"/>
           <w:shd w:fill="auto" w:val="clear"/>
           <w:vertAlign w:val="baseline"/>
@@ -579,8 +579,8 @@
           <w:smallCaps w:val="0"/>
           <w:strike w:val="0"/>
           <w:color w:val="000000"/>
-          <w:sz w:val="20"/>
-          <w:szCs w:val="20"/>
+          <w:sz w:val="24"/>
+          <w:szCs w:val="24"/>
           <w:u w:val="none"/>
           <w:shd w:fill="auto" w:val="clear"/>
           <w:vertAlign w:val="baseline"/>
@@ -672,12 +672,12 @@
           <wp:inline distB="0" distT="0" distL="114300" distR="114300">
             <wp:extent cx="2716213" cy="1759673"/>
             <wp:effectExtent b="0" l="0" r="0" t="0"/>
-            <wp:docPr id="6" name="image1.png"/>
+            <wp:docPr id="7" name="image12.png"/>
             <a:graphic>
               <a:graphicData uri="http://schemas.openxmlformats.org/drawingml/2006/picture">
                 <pic:pic>
                   <pic:nvPicPr>
-                    <pic:cNvPr id="0" name="image1.png"/>
+                    <pic:cNvPr id="0" name="image12.png"/>
                     <pic:cNvPicPr preferRelativeResize="0"/>
                   </pic:nvPicPr>
                   <pic:blipFill>
@@ -714,18 +714,24 @@
         <w:rPr>
           <w:b w:val="1"/>
           <w:bCs w:val="1"/>
-        </w:rPr>
-      </w:pPr>
-      <w:r>
-        <w:rPr>
-          <w:b w:val="1"/>
-          <w:bCs w:val="1"/>
+          <w:sz w:val="18"/>
+          <w:szCs w:val="18"/>
+        </w:rPr>
+      </w:pPr>
+      <w:r>
+        <w:rPr>
+          <w:b w:val="1"/>
+          <w:bCs w:val="1"/>
+          <w:sz w:val="18"/>
+          <w:szCs w:val="18"/>
           <w:rtl w:val="0"/>
         </w:rPr>
         <w:t xml:space="preserve">Fig. 1</w:t>
       </w:r>
       <w:r>
         <w:rPr>
+          <w:sz w:val="18"/>
+          <w:szCs w:val="18"/>
           <w:rtl w:val="0"/>
         </w:rPr>
         <w:t xml:space="preserve"> - Arquitetura Física</w:t>
@@ -762,8 +768,8 @@
           <w:smallCaps w:val="0"/>
           <w:strike w:val="0"/>
           <w:color w:val="000000"/>
-          <w:sz w:val="20"/>
-          <w:szCs w:val="20"/>
+          <w:sz w:val="24"/>
+          <w:szCs w:val="24"/>
           <w:u w:val="none"/>
           <w:shd w:fill="auto" w:val="clear"/>
           <w:vertAlign w:val="baseline"/>
@@ -773,6 +779,8 @@
         <w:rPr>
           <w:b w:val="1"/>
           <w:bCs w:val="1"/>
+          <w:sz w:val="24"/>
+          <w:szCs w:val="24"/>
           <w:rtl w:val="0"/>
         </w:rPr>
         <w:t xml:space="preserve">3 </w:t>
@@ -787,8 +795,8 @@
           <w:smallCaps w:val="0"/>
           <w:strike w:val="0"/>
           <w:color w:val="000000"/>
-          <w:sz w:val="20"/>
-          <w:szCs w:val="20"/>
+          <w:sz w:val="24"/>
+          <w:szCs w:val="24"/>
           <w:u w:val="none"/>
           <w:shd w:fill="auto" w:val="clear"/>
           <w:vertAlign w:val="baseline"/>
@@ -1234,12 +1242,12 @@
             <wp:extent cx="4086225" cy="3769995"/>
             <wp:effectExtent b="0" l="0" r="0" t="0"/>
             <wp:wrapSquare wrapText="bothSides" distB="0" distT="0" distL="0" distR="0"/>
-            <wp:docPr id="2" name="image8.png"/>
+            <wp:docPr id="2" name="image7.png"/>
             <a:graphic>
               <a:graphicData uri="http://schemas.openxmlformats.org/drawingml/2006/picture">
                 <pic:pic>
                   <pic:nvPicPr>
-                    <pic:cNvPr id="0" name="image8.png"/>
+                    <pic:cNvPr id="0" name="image7.png"/>
                     <pic:cNvPicPr preferRelativeResize="0"/>
                   </pic:nvPicPr>
                   <pic:blipFill>
@@ -1834,18 +1842,25 @@
         <w:spacing w:after="0" w:before="0" w:line="240" w:lineRule="auto"/>
         <w:ind w:left="0" w:right="0" w:firstLine="0"/>
         <w:jc w:val="center"/>
-        <w:rPr/>
-      </w:pPr>
-      <w:r>
-        <w:rPr>
-          <w:b w:val="1"/>
-          <w:bCs w:val="1"/>
+        <w:rPr>
+          <w:sz w:val="18"/>
+          <w:szCs w:val="18"/>
+        </w:rPr>
+      </w:pPr>
+      <w:r>
+        <w:rPr>
+          <w:b w:val="1"/>
+          <w:bCs w:val="1"/>
+          <w:sz w:val="18"/>
+          <w:szCs w:val="18"/>
           <w:rtl w:val="0"/>
         </w:rPr>
         <w:t xml:space="preserve">Fig. 2</w:t>
       </w:r>
       <w:r>
         <w:rPr>
+          <w:sz w:val="18"/>
+          <w:szCs w:val="18"/>
           <w:rtl w:val="0"/>
         </w:rPr>
         <w:t xml:space="preserve"> - Arquitetura Lógica</w:t>
@@ -2046,6 +2061,8 @@
         <w:rPr>
           <w:b w:val="1"/>
           <w:bCs w:val="1"/>
+          <w:sz w:val="24"/>
+          <w:szCs w:val="24"/>
         </w:rPr>
       </w:pPr>
       <w:r>
@@ -2054,11 +2071,14 @@
         </w:rPr>
         <w:br w:type="textWrapping"/>
         <w:br w:type="textWrapping"/>
-      </w:r>
-      <w:r>
-        <w:rPr>
-          <w:b w:val="1"/>
-          <w:bCs w:val="1"/>
+        <w:br w:type="textWrapping"/>
+      </w:r>
+      <w:r>
+        <w:rPr>
+          <w:b w:val="1"/>
+          <w:bCs w:val="1"/>
+          <w:sz w:val="24"/>
+          <w:szCs w:val="24"/>
           <w:rtl w:val="0"/>
         </w:rPr>
         <w:t xml:space="preserve">4 Diagrama de pacotes</w:t>
@@ -2103,7 +2123,7 @@
             <wp:extent cx="4057650" cy="2992627"/>
             <wp:effectExtent b="0" l="0" r="0" t="0"/>
             <wp:wrapSquare wrapText="bothSides" distB="114300" distT="114300" distL="114300" distR="114300"/>
-            <wp:docPr id="13" name="image11.png"/>
+            <wp:docPr id="10" name="image11.png"/>
             <a:graphic>
               <a:graphicData uri="http://schemas.openxmlformats.org/drawingml/2006/picture">
                 <pic:pic>
@@ -2140,18 +2160,24 @@
         <w:rPr>
           <w:b w:val="1"/>
           <w:bCs w:val="1"/>
-        </w:rPr>
-      </w:pPr>
-      <w:r>
-        <w:rPr>
-          <w:b w:val="1"/>
-          <w:bCs w:val="1"/>
+          <w:sz w:val="18"/>
+          <w:szCs w:val="18"/>
+        </w:rPr>
+      </w:pPr>
+      <w:r>
+        <w:rPr>
+          <w:b w:val="1"/>
+          <w:bCs w:val="1"/>
+          <w:sz w:val="18"/>
+          <w:szCs w:val="18"/>
           <w:rtl w:val="0"/>
         </w:rPr>
         <w:t xml:space="preserve">Fig. 3</w:t>
       </w:r>
       <w:r>
         <w:rPr>
+          <w:sz w:val="18"/>
+          <w:szCs w:val="18"/>
           <w:rtl w:val="0"/>
         </w:rPr>
         <w:t xml:space="preserve"> - Diagrama de Pacotes</w:t>
@@ -2164,21 +2190,266 @@
     </w:p>
     <w:p>
       <w:pPr>
-        <w:keepNext w:val="1"/>
-        <w:keepLines w:val="1"/>
-        <w:pageBreakBefore w:val="0"/>
-        <w:widowControl w:val="1"/>
-        <w:pBdr>
-          <w:top w:space="0" w:sz="0" w:val="nil"/>
-          <w:left w:space="0" w:sz="0" w:val="nil"/>
-          <w:bottom w:space="0" w:sz="0" w:val="nil"/>
-          <w:right w:space="0" w:sz="0" w:val="nil"/>
-          <w:between w:space="0" w:sz="0" w:val="nil"/>
-        </w:pBdr>
-        <w:shd w:fill="auto" w:val="clear"/>
-        <w:spacing w:after="280" w:before="520" w:line="240" w:lineRule="auto"/>
-        <w:ind w:left="0" w:right="0" w:firstLine="0"/>
-        <w:jc w:val="both"/>
+        <w:ind w:firstLine="0"/>
+        <w:jc w:val="center"/>
+        <w:rPr>
+          <w:b w:val="1"/>
+          <w:bCs w:val="1"/>
+        </w:rPr>
+      </w:pPr>
+      <w:r>
+        <w:rPr>
+          <w:b w:val="1"/>
+          <w:bCs w:val="1"/>
+          <w:rtl w:val="0"/>
+        </w:rPr>
+        <w:br w:type="textWrapping"/>
+      </w:r>
+    </w:p>
+    <w:p>
+      <w:pPr>
+        <w:ind w:firstLine="0"/>
+        <w:jc w:val="center"/>
+        <w:rPr>
+          <w:b w:val="1"/>
+          <w:bCs w:val="1"/>
+        </w:rPr>
+      </w:pPr>
+      <w:r>
+        <w:rPr>
+          <w:rtl w:val="0"/>
+        </w:rPr>
+      </w:r>
+    </w:p>
+    <w:p>
+      <w:pPr>
+        <w:ind w:firstLine="0"/>
+        <w:jc w:val="center"/>
+        <w:rPr>
+          <w:b w:val="1"/>
+          <w:bCs w:val="1"/>
+        </w:rPr>
+      </w:pPr>
+      <w:r>
+        <w:rPr>
+          <w:rtl w:val="0"/>
+        </w:rPr>
+      </w:r>
+    </w:p>
+    <w:p>
+      <w:pPr>
+        <w:ind w:firstLine="0"/>
+        <w:jc w:val="center"/>
+        <w:rPr>
+          <w:b w:val="1"/>
+          <w:bCs w:val="1"/>
+        </w:rPr>
+      </w:pPr>
+      <w:r>
+        <w:rPr>
+          <w:rtl w:val="0"/>
+        </w:rPr>
+      </w:r>
+    </w:p>
+    <w:p>
+      <w:pPr>
+        <w:ind w:firstLine="0"/>
+        <w:jc w:val="center"/>
+        <w:rPr>
+          <w:b w:val="1"/>
+          <w:bCs w:val="1"/>
+        </w:rPr>
+      </w:pPr>
+      <w:r>
+        <w:rPr>
+          <w:rtl w:val="0"/>
+        </w:rPr>
+      </w:r>
+    </w:p>
+    <w:p>
+      <w:pPr>
+        <w:ind w:firstLine="0"/>
+        <w:jc w:val="center"/>
+        <w:rPr>
+          <w:b w:val="1"/>
+          <w:bCs w:val="1"/>
+        </w:rPr>
+      </w:pPr>
+      <w:r>
+        <w:rPr>
+          <w:rtl w:val="0"/>
+        </w:rPr>
+      </w:r>
+    </w:p>
+    <w:p>
+      <w:pPr>
+        <w:ind w:firstLine="0"/>
+        <w:jc w:val="center"/>
+        <w:rPr>
+          <w:b w:val="1"/>
+          <w:bCs w:val="1"/>
+        </w:rPr>
+      </w:pPr>
+      <w:r>
+        <w:rPr>
+          <w:rtl w:val="0"/>
+        </w:rPr>
+      </w:r>
+    </w:p>
+    <w:p>
+      <w:pPr>
+        <w:ind w:firstLine="0"/>
+        <w:jc w:val="center"/>
+        <w:rPr>
+          <w:b w:val="1"/>
+          <w:bCs w:val="1"/>
+        </w:rPr>
+      </w:pPr>
+      <w:r>
+        <w:rPr>
+          <w:rtl w:val="0"/>
+        </w:rPr>
+      </w:r>
+    </w:p>
+    <w:p>
+      <w:pPr>
+        <w:ind w:firstLine="0"/>
+        <w:jc w:val="center"/>
+        <w:rPr>
+          <w:b w:val="1"/>
+          <w:bCs w:val="1"/>
+        </w:rPr>
+      </w:pPr>
+      <w:r>
+        <w:rPr>
+          <w:rtl w:val="0"/>
+        </w:rPr>
+      </w:r>
+    </w:p>
+    <w:p>
+      <w:pPr>
+        <w:ind w:firstLine="0"/>
+        <w:jc w:val="center"/>
+        <w:rPr>
+          <w:b w:val="1"/>
+          <w:bCs w:val="1"/>
+        </w:rPr>
+      </w:pPr>
+      <w:r>
+        <w:rPr>
+          <w:rtl w:val="0"/>
+        </w:rPr>
+      </w:r>
+    </w:p>
+    <w:p>
+      <w:pPr>
+        <w:ind w:firstLine="0"/>
+        <w:jc w:val="center"/>
+        <w:rPr>
+          <w:b w:val="1"/>
+          <w:bCs w:val="1"/>
+        </w:rPr>
+      </w:pPr>
+      <w:r>
+        <w:rPr>
+          <w:rtl w:val="0"/>
+        </w:rPr>
+      </w:r>
+    </w:p>
+    <w:p>
+      <w:pPr>
+        <w:ind w:firstLine="0"/>
+        <w:jc w:val="center"/>
+        <w:rPr>
+          <w:b w:val="1"/>
+          <w:bCs w:val="1"/>
+        </w:rPr>
+      </w:pPr>
+      <w:r>
+        <w:rPr>
+          <w:rtl w:val="0"/>
+        </w:rPr>
+      </w:r>
+    </w:p>
+    <w:p>
+      <w:pPr>
+        <w:ind w:firstLine="0"/>
+        <w:jc w:val="center"/>
+        <w:rPr>
+          <w:b w:val="1"/>
+          <w:bCs w:val="1"/>
+        </w:rPr>
+      </w:pPr>
+      <w:r>
+        <w:rPr>
+          <w:rtl w:val="0"/>
+        </w:rPr>
+      </w:r>
+    </w:p>
+    <w:p>
+      <w:pPr>
+        <w:ind w:firstLine="0"/>
+        <w:jc w:val="center"/>
+        <w:rPr>
+          <w:b w:val="1"/>
+          <w:bCs w:val="1"/>
+        </w:rPr>
+      </w:pPr>
+      <w:r>
+        <w:rPr>
+          <w:rtl w:val="0"/>
+        </w:rPr>
+      </w:r>
+    </w:p>
+    <w:p>
+      <w:pPr>
+        <w:ind w:firstLine="0"/>
+        <w:jc w:val="center"/>
+        <w:rPr>
+          <w:b w:val="1"/>
+          <w:bCs w:val="1"/>
+        </w:rPr>
+      </w:pPr>
+      <w:r>
+        <w:rPr>
+          <w:rtl w:val="0"/>
+        </w:rPr>
+      </w:r>
+    </w:p>
+    <w:p>
+      <w:pPr>
+        <w:ind w:firstLine="0"/>
+        <w:jc w:val="center"/>
+        <w:rPr>
+          <w:b w:val="1"/>
+          <w:bCs w:val="1"/>
+        </w:rPr>
+      </w:pPr>
+      <w:r>
+        <w:rPr>
+          <w:rtl w:val="0"/>
+        </w:rPr>
+      </w:r>
+    </w:p>
+    <w:p>
+      <w:pPr>
+        <w:ind w:firstLine="0"/>
+        <w:jc w:val="center"/>
+        <w:rPr>
+          <w:b w:val="1"/>
+          <w:bCs w:val="1"/>
+        </w:rPr>
+      </w:pPr>
+      <w:r>
+        <w:rPr>
+          <w:rtl w:val="0"/>
+        </w:rPr>
+      </w:r>
+    </w:p>
+    <w:p>
+      <w:pPr>
+        <w:ind w:firstLine="0"/>
+        <w:jc w:val="left"/>
         <w:rPr>
           <w:rFonts w:ascii="Times" w:cs="Times" w:eastAsia="Times" w:hAnsi="Times"/>
           <w:b w:val="1"/>
@@ -2188,6 +2459,8 @@
           <w:smallCaps w:val="0"/>
           <w:strike w:val="0"/>
           <w:color w:val="000000"/>
+          <w:sz w:val="24"/>
+          <w:szCs w:val="24"/>
           <w:u w:val="none"/>
           <w:shd w:fill="auto" w:val="clear"/>
           <w:vertAlign w:val="baseline"/>
@@ -2197,28 +2470,12 @@
         <w:rPr>
           <w:b w:val="1"/>
           <w:bCs w:val="1"/>
-          <w:rtl w:val="0"/>
-        </w:rPr>
+          <w:sz w:val="24"/>
+          <w:szCs w:val="24"/>
+          <w:rtl w:val="0"/>
+        </w:rPr>
+        <w:t xml:space="preserve">5 Diagrama de Modelo de Classes</w:t>
         <w:br w:type="textWrapping"/>
-        <w:br w:type="textWrapping"/>
-        <w:br w:type="textWrapping"/>
-        <w:br w:type="textWrapping"/>
-        <w:br w:type="textWrapping"/>
-        <w:br w:type="textWrapping"/>
-        <w:br w:type="textWrapping"/>
-        <w:br w:type="textWrapping"/>
-        <w:br w:type="textWrapping"/>
-        <w:br w:type="textWrapping"/>
-        <w:br w:type="textWrapping"/>
-        <w:br w:type="textWrapping"/>
-      </w:r>
-      <w:r>
-        <w:rPr>
-          <w:b w:val="1"/>
-          <w:bCs w:val="1"/>
-          <w:rtl w:val="0"/>
-        </w:rPr>
-        <w:t xml:space="preserve">5 Diagrama de Modelo de Classes</w:t>
       </w:r>
       <w:r>
         <w:rPr>
@@ -2241,7 +2498,7 @@
         </w:pBdr>
         <w:shd w:fill="auto" w:val="clear"/>
         <w:spacing w:after="0" w:before="0" w:line="240" w:lineRule="auto"/>
-        <w:ind w:left="0" w:right="0" w:firstLine="0"/>
+        <w:ind w:left="0" w:right="0" w:firstLine="720"/>
         <w:jc w:val="both"/>
         <w:rPr/>
       </w:pPr>
@@ -2249,26 +2506,58 @@
         <w:rPr>
           <w:rtl w:val="0"/>
         </w:rPr>
-        <w:tab/>
         <w:t xml:space="preserve">O diagrama de classes é um dos principais diagramas da linguagem UML,  usado para representar a estrutura estática de um sistema de software.</w:t>
         <w:br w:type="textWrapping"/>
         <w:tab/>
         <w:t xml:space="preserve">No diagrama estão presentes as classes, com os seus atributos e métodos, e as relações entre si.</w:t>
       </w:r>
       <w:r>
+        <w:rPr>
+          <w:rtl w:val="0"/>
+        </w:rPr>
+      </w:r>
+    </w:p>
+    <w:p>
+      <w:pPr>
+        <w:ind w:firstLine="0"/>
+        <w:jc w:val="center"/>
+        <w:rPr>
+          <w:sz w:val="18"/>
+          <w:szCs w:val="18"/>
+        </w:rPr>
+      </w:pPr>
+      <w:r>
+        <w:rPr>
+          <w:b w:val="1"/>
+          <w:bCs w:val="1"/>
+          <w:sz w:val="18"/>
+          <w:szCs w:val="18"/>
+          <w:rtl w:val="0"/>
+        </w:rPr>
+        <w:t xml:space="preserve">Fig. 4</w:t>
+      </w:r>
+      <w:r>
+        <w:rPr>
+          <w:sz w:val="18"/>
+          <w:szCs w:val="18"/>
+          <w:rtl w:val="0"/>
+        </w:rPr>
+        <w:t xml:space="preserve"> - Diagrama de Modelo de Classes</w:t>
+      </w:r>
+      <w:r>
         <w:drawing>
           <wp:anchor allowOverlap="1" behindDoc="0" distB="114300" distT="114300" distL="114300" distR="114300" hidden="0" layoutInCell="1" locked="0" relativeHeight="0" simplePos="0">
             <wp:simplePos x="0" y="0"/>
             <wp:positionH relativeFrom="column">
-              <wp:posOffset>-119062</wp:posOffset>
+              <wp:posOffset>-1461924</wp:posOffset>
             </wp:positionH>
             <wp:positionV relativeFrom="paragraph">
-              <wp:posOffset>790575</wp:posOffset>
+              <wp:posOffset>123825</wp:posOffset>
             </wp:positionV>
-            <wp:extent cx="4642310" cy="2619058"/>
+            <wp:extent cx="7311600" cy="4160485"/>
             <wp:effectExtent b="0" l="0" r="0" t="0"/>
             <wp:wrapSquare wrapText="bothSides" distB="114300" distT="114300" distL="114300" distR="114300"/>
-            <wp:docPr id="1" name="image13.png"/>
+            <wp:docPr id="13" name="image13.png"/>
             <a:graphic>
               <a:graphicData uri="http://schemas.openxmlformats.org/drawingml/2006/picture">
                 <pic:pic>
@@ -2286,7 +2575,7 @@
                   <pic:spPr>
                     <a:xfrm>
                       <a:off x="0" y="0"/>
-                      <a:ext cx="4642310" cy="2619058"/>
+                      <a:ext cx="7311600" cy="4160485"/>
                     </a:xfrm>
                     <a:prstGeom prst="rect"/>
                     <a:ln/>
@@ -2300,100 +2589,6 @@
     </w:p>
     <w:p>
       <w:pPr>
-        <w:ind w:firstLine="0"/>
-        <w:jc w:val="center"/>
-        <w:rPr/>
-      </w:pPr>
-      <w:r>
-        <w:rPr>
-          <w:rtl w:val="0"/>
-        </w:rPr>
-      </w:r>
-    </w:p>
-    <w:p>
-      <w:pPr>
-        <w:ind w:firstLine="0"/>
-        <w:jc w:val="center"/>
-        <w:rPr/>
-      </w:pPr>
-      <w:r>
-        <w:rPr>
-          <w:rtl w:val="0"/>
-        </w:rPr>
-      </w:r>
-    </w:p>
-    <w:p>
-      <w:pPr>
-        <w:ind w:firstLine="0"/>
-        <w:jc w:val="center"/>
-        <w:rPr/>
-      </w:pPr>
-      <w:r>
-        <w:rPr>
-          <w:b w:val="1"/>
-          <w:bCs w:val="1"/>
-          <w:rtl w:val="0"/>
-        </w:rPr>
-        <w:t xml:space="preserve">Fig. 4</w:t>
-      </w:r>
-      <w:r>
-        <w:rPr>
-          <w:rtl w:val="0"/>
-        </w:rPr>
-        <w:t xml:space="preserve"> - Diagrama de Modelo de Classes</w:t>
-      </w:r>
-    </w:p>
-    <w:p>
-      <w:pPr>
-        <w:ind w:firstLine="0"/>
-        <w:jc w:val="center"/>
-        <w:rPr/>
-      </w:pPr>
-      <w:r>
-        <w:rPr>
-          <w:rtl w:val="0"/>
-        </w:rPr>
-        <w:br w:type="textWrapping"/>
-      </w:r>
-    </w:p>
-    <w:p>
-      <w:pPr>
-        <w:ind w:firstLine="0"/>
-        <w:jc w:val="center"/>
-        <w:rPr/>
-      </w:pPr>
-      <w:r>
-        <w:rPr>
-          <w:rtl w:val="0"/>
-        </w:rPr>
-      </w:r>
-    </w:p>
-    <w:p>
-      <w:pPr>
-        <w:ind w:firstLine="0"/>
-        <w:jc w:val="center"/>
-        <w:rPr/>
-      </w:pPr>
-      <w:r>
-        <w:rPr>
-          <w:rtl w:val="0"/>
-        </w:rPr>
-      </w:r>
-    </w:p>
-    <w:p>
-      <w:pPr>
-        <w:ind w:firstLine="0"/>
-        <w:jc w:val="center"/>
-        <w:rPr/>
-      </w:pPr>
-      <w:r>
-        <w:rPr>
-          <w:rtl w:val="0"/>
-        </w:rPr>
-      </w:r>
-    </w:p>
-    <w:p>
-      <w:pPr>
         <w:keepNext w:val="1"/>
         <w:keepLines w:val="1"/>
         <w:pageBreakBefore w:val="0"/>
@@ -2418,8 +2613,8 @@
           <w:smallCaps w:val="0"/>
           <w:strike w:val="0"/>
           <w:color w:val="000000"/>
-          <w:sz w:val="20"/>
-          <w:szCs w:val="20"/>
+          <w:sz w:val="24"/>
+          <w:szCs w:val="24"/>
           <w:u w:val="none"/>
           <w:shd w:fill="auto" w:val="clear"/>
           <w:vertAlign w:val="baseline"/>
@@ -2429,6 +2624,8 @@
         <w:rPr>
           <w:b w:val="1"/>
           <w:bCs w:val="1"/>
+          <w:sz w:val="24"/>
+          <w:szCs w:val="24"/>
           <w:rtl w:val="0"/>
         </w:rPr>
         <w:t xml:space="preserve">6 Diagramas de UC’s</w:t>
@@ -2462,7 +2659,7 @@
         <w:rPr>
           <w:rtl w:val="0"/>
         </w:rPr>
-        <w:t xml:space="preserve">Neste tópico, vão ser apresentados os diagramas de casos de uso (UC’s - </w:t>
+        <w:t xml:space="preserve">Neste tópico, vão ser apresentados os diagramas de casos de uso (UC 's - </w:t>
       </w:r>
       <w:r>
         <w:rPr>
@@ -2494,7 +2691,7 @@
         </w:rPr>
         <w:t xml:space="preserve">descrevem o que o sistema deve fazer e quem interage com ele.</w:t>
         <w:br w:type="textWrapping"/>
-        <w:t xml:space="preserve">Os SSD’s (</w:t>
+        <w:t xml:space="preserve">Os SSD 's (</w:t>
       </w:r>
       <w:r>
         <w:rPr>
@@ -2508,42 +2705,74 @@
         <w:rPr>
           <w:rtl w:val="0"/>
         </w:rPr>
-        <w:t xml:space="preserve"> complementam os UC’s, mostrando a sua implementação.</w:t>
+        <w:t xml:space="preserve"> complementam os UC' s, mostrando a sua implementação.</w:t>
         <w:br w:type="textWrapping"/>
-        <w:br w:type="textWrapping"/>
-      </w:r>
-    </w:p>
-    <w:p>
-      <w:pPr>
-        <w:keepNext w:val="1"/>
-        <w:keepLines w:val="1"/>
-        <w:pageBreakBefore w:val="0"/>
-        <w:widowControl w:val="1"/>
-        <w:pBdr>
-          <w:top w:space="0" w:sz="0" w:val="nil"/>
-          <w:left w:space="0" w:sz="0" w:val="nil"/>
-          <w:bottom w:space="0" w:sz="0" w:val="nil"/>
-          <w:right w:space="0" w:sz="0" w:val="nil"/>
-          <w:between w:space="0" w:sz="0" w:val="nil"/>
-        </w:pBdr>
-        <w:shd w:fill="auto" w:val="clear"/>
-        <w:spacing w:after="240" w:before="120" w:line="240" w:lineRule="auto"/>
-        <w:ind w:left="0" w:right="0" w:firstLine="0"/>
-        <w:jc w:val="both"/>
-        <w:rPr/>
-      </w:pPr>
-      <w:r>
-        <w:rPr/>
+      </w:r>
+    </w:p>
+    <w:p>
+      <w:pPr>
+        <w:ind w:firstLine="0"/>
+        <w:jc w:val="center"/>
+        <w:rPr>
+          <w:sz w:val="18"/>
+          <w:szCs w:val="18"/>
+        </w:rPr>
+      </w:pPr>
+      <w:r>
+        <w:rPr>
+          <w:b w:val="1"/>
+          <w:bCs w:val="1"/>
+          <w:sz w:val="18"/>
+          <w:szCs w:val="18"/>
+          <w:rtl w:val="0"/>
+        </w:rPr>
+        <w:t xml:space="preserve">Fig. 5</w:t>
+      </w:r>
+      <w:r>
+        <w:rPr>
+          <w:sz w:val="18"/>
+          <w:szCs w:val="18"/>
+          <w:rtl w:val="0"/>
+        </w:rPr>
+        <w:t xml:space="preserve"> - UC1 - </w:t>
+      </w:r>
+      <w:r>
+        <w:rPr>
+          <w:i w:val="1"/>
+          <w:iCs w:val="1"/>
+          <w:sz w:val="18"/>
+          <w:szCs w:val="18"/>
+          <w:rtl w:val="0"/>
+        </w:rPr>
+        <w:t xml:space="preserve">Login</w:t>
+      </w:r>
+      <w:r>
+        <w:rPr>
+          <w:sz w:val="18"/>
+          <w:szCs w:val="18"/>
+          <w:rtl w:val="0"/>
+        </w:rPr>
+        <w:t xml:space="preserve"> Cliente</w:t>
+      </w:r>
+      <w:r>
         <w:drawing>
-          <wp:inline distB="114300" distT="114300" distL="114300" distR="114300">
-            <wp:extent cx="4391350" cy="2070100"/>
+          <wp:anchor allowOverlap="1" behindDoc="0" distB="114300" distT="114300" distL="114300" distR="114300" hidden="0" layoutInCell="1" locked="0" relativeHeight="0" simplePos="0">
+            <wp:simplePos x="0" y="0"/>
+            <wp:positionH relativeFrom="column">
+              <wp:posOffset>-1033299</wp:posOffset>
+            </wp:positionH>
+            <wp:positionV relativeFrom="paragraph">
+              <wp:posOffset>152400</wp:posOffset>
+            </wp:positionV>
+            <wp:extent cx="6454800" cy="3091920"/>
             <wp:effectExtent b="0" l="0" r="0" t="0"/>
-            <wp:docPr id="9" name="image6.png"/>
+            <wp:wrapSquare wrapText="bothSides" distB="114300" distT="114300" distL="114300" distR="114300"/>
+            <wp:docPr id="11" name="image9.png"/>
             <a:graphic>
               <a:graphicData uri="http://schemas.openxmlformats.org/drawingml/2006/picture">
                 <pic:pic>
                   <pic:nvPicPr>
-                    <pic:cNvPr id="0" name="image6.png"/>
+                    <pic:cNvPr id="0" name="image9.png"/>
                     <pic:cNvPicPr preferRelativeResize="0"/>
                   </pic:nvPicPr>
                   <pic:blipFill>
@@ -2556,7 +2785,7 @@
                   <pic:spPr>
                     <a:xfrm>
                       <a:off x="0" y="0"/>
-                      <a:ext cx="4391350" cy="2070100"/>
+                      <a:ext cx="6454800" cy="3091920"/>
                     </a:xfrm>
                     <a:prstGeom prst="rect"/>
                     <a:ln/>
@@ -2564,34 +2793,88 @@
                 </pic:pic>
               </a:graphicData>
             </a:graphic>
-          </wp:inline>
+          </wp:anchor>
         </w:drawing>
       </w:r>
-      <w:r>
-        <w:rPr>
-          <w:rtl w:val="0"/>
-        </w:rPr>
-      </w:r>
-    </w:p>
-    <w:p>
-      <w:pPr>
-        <w:ind w:firstLine="0"/>
-        <w:jc w:val="center"/>
-        <w:rPr/>
-      </w:pPr>
-      <w:r>
-        <w:rPr>
-          <w:b w:val="1"/>
-          <w:bCs w:val="1"/>
-          <w:rtl w:val="0"/>
-        </w:rPr>
-        <w:t xml:space="preserve">Fig. 5</w:t>
-      </w:r>
-      <w:r>
-        <w:rPr>
-          <w:rtl w:val="0"/>
-        </w:rPr>
-        <w:t xml:space="preserve"> - UC1 - Login Cliente</w:t>
+    </w:p>
+    <w:p>
+      <w:pPr>
+        <w:ind w:firstLine="0"/>
+        <w:jc w:val="center"/>
+        <w:rPr/>
+      </w:pPr>
+      <w:r>
+        <w:rPr>
+          <w:rtl w:val="0"/>
+        </w:rPr>
+      </w:r>
+    </w:p>
+    <w:p>
+      <w:pPr>
+        <w:ind w:firstLine="0"/>
+        <w:rPr/>
+      </w:pPr>
+      <w:r>
+        <w:rPr>
+          <w:rtl w:val="0"/>
+        </w:rPr>
+        <w:t xml:space="preserve">Este SSD descreve a interação entre o Cliente e o sistema durante o processo de autenticação. O Cliente introduz as suas credenciais (nome, </w:t>
+      </w:r>
+      <w:r>
+        <w:rPr>
+          <w:i w:val="1"/>
+          <w:iCs w:val="1"/>
+          <w:rtl w:val="0"/>
+        </w:rPr>
+        <w:t xml:space="preserve">email</w:t>
+      </w:r>
+      <w:r>
+        <w:rPr>
+          <w:rtl w:val="0"/>
+        </w:rPr>
+        <w:t xml:space="preserve"> e </w:t>
+      </w:r>
+      <w:r>
+        <w:rPr>
+          <w:i w:val="1"/>
+          <w:iCs w:val="1"/>
+          <w:rtl w:val="0"/>
+        </w:rPr>
+        <w:t xml:space="preserve">password</w:t>
+      </w:r>
+      <w:r>
+        <w:rPr>
+          <w:rtl w:val="0"/>
+        </w:rPr>
+        <w:t xml:space="preserve">) através da interface de </w:t>
+      </w:r>
+      <w:r>
+        <w:rPr>
+          <w:i w:val="1"/>
+          <w:iCs w:val="1"/>
+          <w:rtl w:val="0"/>
+        </w:rPr>
+        <w:t xml:space="preserve">login</w:t>
+      </w:r>
+      <w:r>
+        <w:rPr>
+          <w:rtl w:val="0"/>
+        </w:rPr>
+        <w:t xml:space="preserve">. O sistema recolhe os dados, cria um objeto de transferência (DTO) e envia as credenciais para a camada de serviço, que valida a informação comparando-a com os dados armazenados no modelo. Caso as credenciais sejam válidas, o sistema confirma o </w:t>
+      </w:r>
+      <w:r>
+        <w:rPr>
+          <w:i w:val="1"/>
+          <w:iCs w:val="1"/>
+          <w:rtl w:val="0"/>
+        </w:rPr>
+        <w:t xml:space="preserve">login</w:t>
+      </w:r>
+      <w:r>
+        <w:rPr>
+          <w:rtl w:val="0"/>
+        </w:rPr>
+        <w:t xml:space="preserve"> com sucesso; caso contrário, o acesso é negado. </w:t>
       </w:r>
     </w:p>
     <w:p>
@@ -2618,63 +2901,25 @@
           <w:rtl w:val="0"/>
         </w:rPr>
       </w:r>
-    </w:p>
-    <w:p>
-      <w:pPr>
-        <w:keepNext w:val="1"/>
-        <w:keepLines w:val="1"/>
-        <w:pageBreakBefore w:val="0"/>
-        <w:widowControl w:val="1"/>
-        <w:pBdr>
-          <w:top w:space="0" w:sz="0" w:val="nil"/>
-          <w:left w:space="0" w:sz="0" w:val="nil"/>
-          <w:bottom w:space="0" w:sz="0" w:val="nil"/>
-          <w:right w:space="0" w:sz="0" w:val="nil"/>
-          <w:between w:space="0" w:sz="0" w:val="nil"/>
-        </w:pBdr>
-        <w:shd w:fill="auto" w:val="clear"/>
-        <w:spacing w:after="240" w:before="120" w:line="240" w:lineRule="auto"/>
-        <w:ind w:left="0" w:right="0" w:firstLine="0"/>
-        <w:jc w:val="both"/>
-        <w:rPr/>
-      </w:pPr>
-      <w:r>
-        <w:rPr>
-          <w:rtl w:val="0"/>
-        </w:rPr>
-      </w:r>
-    </w:p>
-    <w:p>
-      <w:pPr>
-        <w:keepNext w:val="1"/>
-        <w:keepLines w:val="1"/>
-        <w:pageBreakBefore w:val="0"/>
-        <w:widowControl w:val="1"/>
-        <w:pBdr>
-          <w:top w:space="0" w:sz="0" w:val="nil"/>
-          <w:left w:space="0" w:sz="0" w:val="nil"/>
-          <w:bottom w:space="0" w:sz="0" w:val="nil"/>
-          <w:right w:space="0" w:sz="0" w:val="nil"/>
-          <w:between w:space="0" w:sz="0" w:val="nil"/>
-        </w:pBdr>
-        <w:shd w:fill="auto" w:val="clear"/>
-        <w:spacing w:after="240" w:before="120" w:line="240" w:lineRule="auto"/>
-        <w:ind w:left="0" w:right="0" w:firstLine="0"/>
-        <w:jc w:val="both"/>
-        <w:rPr/>
-      </w:pPr>
-      <w:r>
-        <w:rPr/>
+      <w:r>
         <w:drawing>
-          <wp:inline distB="114300" distT="114300" distL="114300" distR="114300">
-            <wp:extent cx="4391350" cy="2032000"/>
+          <wp:anchor allowOverlap="1" behindDoc="0" distB="114300" distT="114300" distL="114300" distR="114300" hidden="0" layoutInCell="1" locked="0" relativeHeight="0" simplePos="0">
+            <wp:simplePos x="0" y="0"/>
+            <wp:positionH relativeFrom="column">
+              <wp:posOffset>-1033299</wp:posOffset>
+            </wp:positionH>
+            <wp:positionV relativeFrom="paragraph">
+              <wp:posOffset>114300</wp:posOffset>
+            </wp:positionV>
+            <wp:extent cx="6454800" cy="2956947"/>
             <wp:effectExtent b="0" l="0" r="0" t="0"/>
-            <wp:docPr id="4" name="image2.png"/>
+            <wp:wrapSquare wrapText="bothSides" distB="114300" distT="114300" distL="114300" distR="114300"/>
+            <wp:docPr id="1" name="image4.png"/>
             <a:graphic>
               <a:graphicData uri="http://schemas.openxmlformats.org/drawingml/2006/picture">
                 <pic:pic>
                   <pic:nvPicPr>
-                    <pic:cNvPr id="0" name="image2.png"/>
+                    <pic:cNvPr id="0" name="image4.png"/>
                     <pic:cNvPicPr preferRelativeResize="0"/>
                   </pic:nvPicPr>
                   <pic:blipFill>
@@ -2687,7 +2932,7 @@
                   <pic:spPr>
                     <a:xfrm>
                       <a:off x="0" y="0"/>
-                      <a:ext cx="4391350" cy="2032000"/>
+                      <a:ext cx="6454800" cy="2956947"/>
                     </a:xfrm>
                     <a:prstGeom prst="rect"/>
                     <a:ln/>
@@ -2695,31 +2940,33 @@
                 </pic:pic>
               </a:graphicData>
             </a:graphic>
-          </wp:inline>
+          </wp:anchor>
         </w:drawing>
       </w:r>
-      <w:r>
-        <w:rPr>
-          <w:rtl w:val="0"/>
-        </w:rPr>
-      </w:r>
-    </w:p>
-    <w:p>
-      <w:pPr>
-        <w:ind w:firstLine="0"/>
-        <w:jc w:val="center"/>
-        <w:rPr/>
-      </w:pPr>
-      <w:r>
-        <w:rPr>
-          <w:b w:val="1"/>
-          <w:bCs w:val="1"/>
+    </w:p>
+    <w:p>
+      <w:pPr>
+        <w:ind w:left="1440" w:firstLine="720"/>
+        <w:jc w:val="left"/>
+        <w:rPr>
+          <w:sz w:val="18"/>
+          <w:szCs w:val="18"/>
+        </w:rPr>
+      </w:pPr>
+      <w:r>
+        <w:rPr>
+          <w:b w:val="1"/>
+          <w:bCs w:val="1"/>
+          <w:sz w:val="18"/>
+          <w:szCs w:val="18"/>
           <w:rtl w:val="0"/>
         </w:rPr>
         <w:t xml:space="preserve">Fig. 6</w:t>
       </w:r>
       <w:r>
         <w:rPr>
+          <w:sz w:val="18"/>
+          <w:szCs w:val="18"/>
           <w:rtl w:val="0"/>
         </w:rPr>
         <w:t xml:space="preserve"> - UC2 - Registo de Cliente</w:t>
@@ -2727,9 +2974,32 @@
     </w:p>
     <w:p>
       <w:pPr>
-        <w:ind w:firstLine="0"/>
-        <w:jc w:val="center"/>
-        <w:rPr/>
+        <w:ind w:left="1440" w:firstLine="720"/>
+        <w:rPr/>
+      </w:pPr>
+      <w:r>
+        <w:rPr>
+          <w:sz w:val="18"/>
+          <w:szCs w:val="18"/>
+          <w:rtl w:val="0"/>
+        </w:rPr>
+        <w:br w:type="textWrapping"/>
+      </w:r>
+      <w:r>
+        <w:rPr>
+          <w:rtl w:val="0"/>
+        </w:rPr>
+        <w:t xml:space="preserve">Este SSD descreve a interação entre o Cliente e o sistema durante o processo de registo. O Cliente seleciona a opção de registo e introduz os seus dados pessoais (nome, email e palavra-passe) através da interface. O sistema recolhe a informação, cria um objeto de transferência (DTO) e encaminha os dados para a camada de serviço. Esta valida o pedido e adiciona o novo Cliente ao contentor correspondente no modelo. Após a criação bem-sucedida do Cliente, o sistema confirma o registo. </w:t>
+      </w:r>
+    </w:p>
+    <w:p>
+      <w:pPr>
+        <w:ind w:firstLine="0"/>
+        <w:jc w:val="center"/>
+        <w:rPr>
+          <w:b w:val="1"/>
+          <w:bCs w:val="1"/>
+        </w:rPr>
       </w:pPr>
       <w:r>
         <w:rPr>
@@ -2747,33 +3017,79 @@
         <w:rPr>
           <w:rtl w:val="0"/>
         </w:rPr>
-        <w:t xml:space="preserve">                                           </w:t>
-      </w:r>
-    </w:p>
-    <w:p>
-      <w:pPr>
-        <w:ind w:firstLine="0"/>
-        <w:jc w:val="center"/>
-        <w:rPr>
-          <w:b w:val="1"/>
-          <w:bCs w:val="1"/>
-        </w:rPr>
-      </w:pPr>
-      <w:r>
-        <w:rPr>
-          <w:b w:val="1"/>
-          <w:bCs w:val="1"/>
-        </w:rPr>
+      </w:r>
+    </w:p>
+    <w:p>
+      <w:pPr>
+        <w:ind w:firstLine="0"/>
+        <w:jc w:val="center"/>
+        <w:rPr/>
+      </w:pPr>
+      <w:r>
+        <w:rPr>
+          <w:rtl w:val="0"/>
+        </w:rPr>
+      </w:r>
+    </w:p>
+    <w:p>
+      <w:pPr>
+        <w:ind w:firstLine="0"/>
+        <w:jc w:val="center"/>
+        <w:rPr>
+          <w:b w:val="1"/>
+          <w:bCs w:val="1"/>
+        </w:rPr>
+      </w:pPr>
+      <w:r>
+        <w:rPr>
+          <w:b w:val="1"/>
+          <w:bCs w:val="1"/>
+          <w:rtl w:val="0"/>
+        </w:rPr>
+        <w:br w:type="textWrapping"/>
+      </w:r>
+      <w:r>
+        <w:rPr>
+          <w:b w:val="1"/>
+          <w:bCs w:val="1"/>
+          <w:sz w:val="18"/>
+          <w:szCs w:val="18"/>
+          <w:rtl w:val="0"/>
+        </w:rPr>
+        <w:t xml:space="preserve">Fig. 7 - </w:t>
+      </w:r>
+      <w:r>
+        <w:rPr>
+          <w:sz w:val="18"/>
+          <w:szCs w:val="18"/>
+          <w:rtl w:val="0"/>
+        </w:rPr>
+        <w:t xml:space="preserve">UC3 - Registo de Organizador</w:t>
+      </w:r>
+      <w:r>
+        <w:rPr>
+          <w:rtl w:val="0"/>
+        </w:rPr>
+      </w:r>
+      <w:r>
         <w:drawing>
-          <wp:inline distB="114300" distT="114300" distL="114300" distR="114300">
-            <wp:extent cx="4391350" cy="3721100"/>
+          <wp:anchor allowOverlap="1" behindDoc="0" distB="114300" distT="114300" distL="114300" distR="114300" hidden="0" layoutInCell="1" locked="0" relativeHeight="0" simplePos="0">
+            <wp:simplePos x="0" y="0"/>
+            <wp:positionH relativeFrom="column">
+              <wp:posOffset>-938049</wp:posOffset>
+            </wp:positionH>
+            <wp:positionV relativeFrom="paragraph">
+              <wp:posOffset>325966</wp:posOffset>
+            </wp:positionV>
+            <wp:extent cx="6270500" cy="2733992"/>
             <wp:effectExtent b="0" l="0" r="0" t="0"/>
-            <wp:docPr id="10" name="image9.png"/>
+            <wp:wrapSquare wrapText="bothSides" distB="114300" distT="114300" distL="114300" distR="114300"/>
+            <wp:docPr id="4" name="image10.png"/>
             <a:graphic>
               <a:graphicData uri="http://schemas.openxmlformats.org/drawingml/2006/picture">
                 <pic:pic>
                   <pic:nvPicPr>
-                    <pic:cNvPr id="0" name="image9.png"/>
+                    <pic:cNvPr id="0" name="image10.png"/>
                     <pic:cNvPicPr preferRelativeResize="0"/>
                   </pic:nvPicPr>
                   <pic:blipFill>
@@ -2786,7 +3102,7 @@
                   <pic:spPr>
                     <a:xfrm>
                       <a:off x="0" y="0"/>
-                      <a:ext cx="4391350" cy="3721100"/>
+                      <a:ext cx="6270500" cy="2733992"/>
                     </a:xfrm>
                     <a:prstGeom prst="rect"/>
                     <a:ln/>
@@ -2794,79 +3110,231 @@
                 </pic:pic>
               </a:graphicData>
             </a:graphic>
-          </wp:inline>
+          </wp:anchor>
         </w:drawing>
       </w:r>
-      <w:r>
-        <w:rPr>
-          <w:rtl w:val="0"/>
-        </w:rPr>
-      </w:r>
-    </w:p>
-    <w:p>
-      <w:pPr>
-        <w:ind w:firstLine="0"/>
-        <w:jc w:val="center"/>
-        <w:rPr/>
-      </w:pPr>
-      <w:r>
-        <w:rPr>
-          <w:b w:val="1"/>
-          <w:bCs w:val="1"/>
-          <w:rtl w:val="0"/>
-        </w:rPr>
-        <w:t xml:space="preserve">Fig. 7</w:t>
-      </w:r>
-      <w:r>
-        <w:rPr>
-          <w:rtl w:val="0"/>
-        </w:rPr>
-        <w:t xml:space="preserve"> -UC3 - Editar Evento como Organizador</w:t>
+    </w:p>
+    <w:p>
+      <w:pPr>
+        <w:ind w:firstLine="0"/>
+        <w:rPr>
+          <w:b w:val="1"/>
+          <w:bCs w:val="1"/>
+        </w:rPr>
+      </w:pPr>
+      <w:r>
+        <w:rPr>
+          <w:b w:val="1"/>
+          <w:bCs w:val="1"/>
+          <w:rtl w:val="0"/>
+        </w:rPr>
         <w:br w:type="textWrapping"/>
       </w:r>
-    </w:p>
-    <w:p>
-      <w:pPr>
-        <w:ind w:firstLine="0"/>
-        <w:jc w:val="center"/>
-        <w:rPr/>
-      </w:pPr>
-      <w:r>
-        <w:rPr>
-          <w:rtl w:val="0"/>
-        </w:rPr>
-      </w:r>
-    </w:p>
-    <w:p>
-      <w:pPr>
-        <w:ind w:firstLine="0"/>
-        <w:jc w:val="center"/>
-        <w:rPr/>
-      </w:pPr>
-      <w:r>
-        <w:rPr>
-          <w:rtl w:val="0"/>
-        </w:rPr>
-      </w:r>
-    </w:p>
-    <w:p>
-      <w:pPr>
-        <w:ind w:firstLine="0"/>
-        <w:jc w:val="center"/>
-        <w:rPr/>
-      </w:pPr>
-      <w:r>
-        <w:rPr/>
+      <w:r>
+        <w:rPr>
+          <w:rtl w:val="0"/>
+        </w:rPr>
+        <w:t xml:space="preserve">Este SSD descreve a interação entre o Organizador e o sistema durante o processo de registo. O utilizador seleciona a opção de registo como Organizador e introduz os seus dados (nome, email, palavra-passe e identificador). O sistema recolhe a informação através da interface, cria um objeto de transferência (DTO) e envia os dados para a camada de serviço. Esta acede ao modelo e adiciona o novo Organizador ao respetivo contentor. Após a criação bem-sucedida do Organizador, o sistema confirma o registo. </w:t>
+      </w:r>
+      <w:r>
+        <w:rPr>
+          <w:b w:val="1"/>
+          <w:bCs w:val="1"/>
+          <w:rtl w:val="0"/>
+        </w:rPr>
+        <w:br w:type="textWrapping"/>
+        <w:br w:type="textWrapping"/>
+        <w:br w:type="textWrapping"/>
+        <w:br w:type="textWrapping"/>
+        <w:br w:type="textWrapping"/>
+      </w:r>
+    </w:p>
+    <w:p>
+      <w:pPr>
+        <w:ind w:firstLine="0"/>
+        <w:rPr>
+          <w:b w:val="1"/>
+          <w:bCs w:val="1"/>
+        </w:rPr>
+      </w:pPr>
+      <w:r>
+        <w:rPr>
+          <w:rtl w:val="0"/>
+        </w:rPr>
+      </w:r>
+    </w:p>
+    <w:p>
+      <w:pPr>
+        <w:ind w:firstLine="0"/>
+        <w:rPr>
+          <w:b w:val="1"/>
+          <w:bCs w:val="1"/>
+        </w:rPr>
+      </w:pPr>
+      <w:r>
+        <w:rPr>
+          <w:rtl w:val="0"/>
+        </w:rPr>
+      </w:r>
+    </w:p>
+    <w:p>
+      <w:pPr>
+        <w:ind w:firstLine="0"/>
+        <w:rPr>
+          <w:b w:val="1"/>
+          <w:bCs w:val="1"/>
+        </w:rPr>
+      </w:pPr>
+      <w:r>
+        <w:rPr>
+          <w:rtl w:val="0"/>
+        </w:rPr>
+      </w:r>
+    </w:p>
+    <w:p>
+      <w:pPr>
+        <w:ind w:firstLine="0"/>
+        <w:rPr>
+          <w:b w:val="1"/>
+          <w:bCs w:val="1"/>
+        </w:rPr>
+      </w:pPr>
+      <w:r>
+        <w:rPr>
+          <w:rtl w:val="0"/>
+        </w:rPr>
+      </w:r>
+    </w:p>
+    <w:p>
+      <w:pPr>
+        <w:ind w:firstLine="0"/>
+        <w:rPr>
+          <w:b w:val="1"/>
+          <w:bCs w:val="1"/>
+        </w:rPr>
+      </w:pPr>
+      <w:r>
+        <w:rPr>
+          <w:rtl w:val="0"/>
+        </w:rPr>
+      </w:r>
+    </w:p>
+    <w:p>
+      <w:pPr>
+        <w:ind w:firstLine="0"/>
+        <w:rPr>
+          <w:b w:val="1"/>
+          <w:bCs w:val="1"/>
+        </w:rPr>
+      </w:pPr>
+      <w:r>
+        <w:rPr>
+          <w:rtl w:val="0"/>
+        </w:rPr>
+      </w:r>
+    </w:p>
+    <w:p>
+      <w:pPr>
+        <w:ind w:firstLine="0"/>
+        <w:rPr>
+          <w:b w:val="1"/>
+          <w:bCs w:val="1"/>
+        </w:rPr>
+      </w:pPr>
+      <w:r>
+        <w:rPr>
+          <w:rtl w:val="0"/>
+        </w:rPr>
+      </w:r>
+    </w:p>
+    <w:p>
+      <w:pPr>
+        <w:ind w:firstLine="0"/>
+        <w:rPr>
+          <w:b w:val="1"/>
+          <w:bCs w:val="1"/>
+        </w:rPr>
+      </w:pPr>
+      <w:r>
+        <w:rPr>
+          <w:rtl w:val="0"/>
+        </w:rPr>
+      </w:r>
+    </w:p>
+    <w:p>
+      <w:pPr>
+        <w:ind w:firstLine="0"/>
+        <w:rPr>
+          <w:b w:val="1"/>
+          <w:bCs w:val="1"/>
+        </w:rPr>
+      </w:pPr>
+      <w:r>
+        <w:rPr>
+          <w:rtl w:val="0"/>
+        </w:rPr>
+      </w:r>
+    </w:p>
+    <w:p>
+      <w:pPr>
+        <w:ind w:firstLine="0"/>
+        <w:rPr>
+          <w:b w:val="1"/>
+          <w:bCs w:val="1"/>
+        </w:rPr>
+      </w:pPr>
+      <w:r>
+        <w:rPr>
+          <w:rtl w:val="0"/>
+        </w:rPr>
+      </w:r>
+    </w:p>
+    <w:p>
+      <w:pPr>
+        <w:ind w:firstLine="0"/>
+        <w:rPr>
+          <w:b w:val="1"/>
+          <w:bCs w:val="1"/>
+        </w:rPr>
+      </w:pPr>
+      <w:r>
+        <w:rPr>
+          <w:rtl w:val="0"/>
+        </w:rPr>
+      </w:r>
+    </w:p>
+    <w:p>
+      <w:pPr>
+        <w:ind w:firstLine="0"/>
+        <w:rPr>
+          <w:b w:val="1"/>
+          <w:bCs w:val="1"/>
+        </w:rPr>
+      </w:pPr>
+      <w:r>
+        <w:rPr>
+          <w:rtl w:val="0"/>
+        </w:rPr>
+      </w:r>
+      <w:r>
         <w:drawing>
-          <wp:inline distB="114300" distT="114300" distL="114300" distR="114300">
-            <wp:extent cx="4391350" cy="1473200"/>
+          <wp:anchor allowOverlap="1" behindDoc="0" distB="114300" distT="114300" distL="114300" distR="114300" hidden="0" layoutInCell="1" locked="0" relativeHeight="0" simplePos="0">
+            <wp:simplePos x="0" y="0"/>
+            <wp:positionH relativeFrom="column">
+              <wp:posOffset>-1266661</wp:posOffset>
+            </wp:positionH>
+            <wp:positionV relativeFrom="paragraph">
+              <wp:posOffset>180975</wp:posOffset>
+            </wp:positionV>
+            <wp:extent cx="6926263" cy="2330594"/>
             <wp:effectExtent b="0" l="0" r="0" t="0"/>
-            <wp:docPr id="12" name="image12.png"/>
+            <wp:wrapSquare wrapText="bothSides" distB="114300" distT="114300" distL="114300" distR="114300"/>
+            <wp:docPr id="3" name="image6.png"/>
             <a:graphic>
               <a:graphicData uri="http://schemas.openxmlformats.org/drawingml/2006/picture">
                 <pic:pic>
                   <pic:nvPicPr>
-                    <pic:cNvPr id="0" name="image12.png"/>
+                    <pic:cNvPr id="0" name="image6.png"/>
                     <pic:cNvPicPr preferRelativeResize="0"/>
                   </pic:nvPicPr>
                   <pic:blipFill>
@@ -2879,7 +3347,7 @@
                   <pic:spPr>
                     <a:xfrm>
                       <a:off x="0" y="0"/>
-                      <a:ext cx="4391350" cy="1473200"/>
+                      <a:ext cx="6926263" cy="2330594"/>
                     </a:xfrm>
                     <a:prstGeom prst="rect"/>
                     <a:ln/>
@@ -2887,72 +3355,321 @@
                 </pic:pic>
               </a:graphicData>
             </a:graphic>
-          </wp:inline>
+          </wp:anchor>
         </w:drawing>
       </w:r>
-      <w:r>
-        <w:rPr>
-          <w:rtl w:val="0"/>
-        </w:rPr>
-        <w:br w:type="textWrapping"/>
-      </w:r>
-      <w:r>
-        <w:rPr>
-          <w:b w:val="1"/>
-          <w:bCs w:val="1"/>
-          <w:rtl w:val="0"/>
-        </w:rPr>
-        <w:t xml:space="preserve">Fig. 8</w:t>
-      </w:r>
-      <w:r>
-        <w:rPr>
-          <w:rtl w:val="0"/>
-        </w:rPr>
-        <w:t xml:space="preserve"> - UC4 - Ver lista de eventos como cliente</w:t>
-      </w:r>
-    </w:p>
-    <w:p>
-      <w:pPr>
-        <w:ind w:firstLine="0"/>
-        <w:jc w:val="center"/>
-        <w:rPr/>
-      </w:pPr>
-      <w:r>
-        <w:rPr>
-          <w:rtl w:val="0"/>
-        </w:rPr>
-      </w:r>
-    </w:p>
-    <w:p>
-      <w:pPr>
-        <w:ind w:firstLine="0"/>
-        <w:jc w:val="center"/>
-        <w:rPr/>
-      </w:pPr>
-      <w:r>
-        <w:rPr>
-          <w:rtl w:val="0"/>
-        </w:rPr>
-      </w:r>
-    </w:p>
-    <w:p>
-      <w:pPr>
-        <w:ind w:firstLine="0"/>
-        <w:jc w:val="center"/>
-        <w:rPr/>
-      </w:pPr>
-      <w:r>
-        <w:rPr/>
+    </w:p>
+    <w:p>
+      <w:pPr>
+        <w:ind w:firstLine="0"/>
+        <w:jc w:val="center"/>
+        <w:rPr>
+          <w:sz w:val="18"/>
+          <w:szCs w:val="18"/>
+        </w:rPr>
+      </w:pPr>
+      <w:r>
+        <w:rPr>
+          <w:b w:val="1"/>
+          <w:bCs w:val="1"/>
+          <w:sz w:val="18"/>
+          <w:szCs w:val="18"/>
+          <w:rtl w:val="0"/>
+        </w:rPr>
+        <w:t xml:space="preserve">Fig. 8 - </w:t>
+      </w:r>
+      <w:r>
+        <w:rPr>
+          <w:sz w:val="18"/>
+          <w:szCs w:val="18"/>
+          <w:rtl w:val="0"/>
+        </w:rPr>
+        <w:t xml:space="preserve">UC4 - Ver lista de eventos como cliente</w:t>
+      </w:r>
+    </w:p>
+    <w:p>
+      <w:pPr>
+        <w:ind w:firstLine="0"/>
+        <w:jc w:val="center"/>
+        <w:rPr>
+          <w:sz w:val="18"/>
+          <w:szCs w:val="18"/>
+        </w:rPr>
+      </w:pPr>
+      <w:r>
+        <w:rPr>
+          <w:rtl w:val="0"/>
+        </w:rPr>
+      </w:r>
+    </w:p>
+    <w:p>
+      <w:pPr>
+        <w:ind w:firstLine="0"/>
+        <w:rPr/>
+      </w:pPr>
+      <w:r>
+        <w:rPr>
+          <w:rtl w:val="0"/>
+        </w:rPr>
+        <w:t xml:space="preserve">Este SSD descreve a interação entre o Cliente e o sistema quando é solicitada a visualização da lista de eventos disponíveis. O Cliente seleciona a opção para ver a lista de eventos através da interface. O sistema processa o pedido, acede à camada de serviço e obtém o modelo de dados, consultando o contentor de eventos. A lista completa de eventos é então recuperada e devolvida à interface, sendo apresentada ao Cliente com sucesso. </w:t>
+      </w:r>
+    </w:p>
+    <w:p>
+      <w:pPr>
+        <w:ind w:firstLine="0"/>
+        <w:rPr/>
+      </w:pPr>
+      <w:r>
+        <w:rPr>
+          <w:rtl w:val="0"/>
+        </w:rPr>
+      </w:r>
+    </w:p>
+    <w:p>
+      <w:pPr>
+        <w:ind w:firstLine="0"/>
+        <w:rPr/>
+      </w:pPr>
+      <w:r>
+        <w:rPr>
+          <w:rtl w:val="0"/>
+        </w:rPr>
+      </w:r>
+    </w:p>
+    <w:p>
+      <w:pPr>
+        <w:ind w:firstLine="0"/>
+        <w:rPr/>
+      </w:pPr>
+      <w:r>
+        <w:rPr>
+          <w:rtl w:val="0"/>
+        </w:rPr>
+      </w:r>
+    </w:p>
+    <w:p>
+      <w:pPr>
+        <w:ind w:firstLine="0"/>
+        <w:rPr/>
+      </w:pPr>
+      <w:r>
+        <w:rPr>
+          <w:rtl w:val="0"/>
+        </w:rPr>
+      </w:r>
+    </w:p>
+    <w:p>
+      <w:pPr>
+        <w:ind w:firstLine="0"/>
+        <w:rPr/>
+      </w:pPr>
+      <w:r>
+        <w:rPr>
+          <w:rtl w:val="0"/>
+        </w:rPr>
+      </w:r>
+    </w:p>
+    <w:p>
+      <w:pPr>
+        <w:ind w:firstLine="0"/>
+        <w:rPr/>
+      </w:pPr>
+      <w:r>
+        <w:rPr>
+          <w:rtl w:val="0"/>
+        </w:rPr>
+      </w:r>
+    </w:p>
+    <w:p>
+      <w:pPr>
+        <w:ind w:firstLine="0"/>
+        <w:rPr/>
+      </w:pPr>
+      <w:r>
+        <w:rPr>
+          <w:rtl w:val="0"/>
+        </w:rPr>
+      </w:r>
+    </w:p>
+    <w:p>
+      <w:pPr>
+        <w:ind w:firstLine="0"/>
+        <w:rPr/>
+      </w:pPr>
+      <w:r>
+        <w:rPr>
+          <w:rtl w:val="0"/>
+        </w:rPr>
+      </w:r>
+    </w:p>
+    <w:p>
+      <w:pPr>
+        <w:ind w:firstLine="0"/>
+        <w:rPr/>
+      </w:pPr>
+      <w:r>
+        <w:rPr>
+          <w:rtl w:val="0"/>
+        </w:rPr>
+      </w:r>
+    </w:p>
+    <w:p>
+      <w:pPr>
+        <w:ind w:firstLine="0"/>
+        <w:rPr/>
+      </w:pPr>
+      <w:r>
+        <w:rPr>
+          <w:rtl w:val="0"/>
+        </w:rPr>
+      </w:r>
+    </w:p>
+    <w:p>
+      <w:pPr>
+        <w:ind w:firstLine="0"/>
+        <w:rPr/>
+      </w:pPr>
+      <w:r>
+        <w:rPr>
+          <w:rtl w:val="0"/>
+        </w:rPr>
+      </w:r>
+    </w:p>
+    <w:p>
+      <w:pPr>
+        <w:ind w:firstLine="0"/>
+        <w:rPr/>
+      </w:pPr>
+      <w:r>
+        <w:rPr>
+          <w:rtl w:val="0"/>
+        </w:rPr>
+      </w:r>
+    </w:p>
+    <w:p>
+      <w:pPr>
+        <w:ind w:firstLine="0"/>
+        <w:rPr/>
+      </w:pPr>
+      <w:r>
+        <w:rPr>
+          <w:rtl w:val="0"/>
+        </w:rPr>
+      </w:r>
+    </w:p>
+    <w:p>
+      <w:pPr>
+        <w:ind w:firstLine="0"/>
+        <w:rPr/>
+      </w:pPr>
+      <w:r>
+        <w:rPr>
+          <w:rtl w:val="0"/>
+        </w:rPr>
+      </w:r>
+    </w:p>
+    <w:p>
+      <w:pPr>
+        <w:ind w:firstLine="0"/>
+        <w:rPr/>
+      </w:pPr>
+      <w:r>
+        <w:rPr>
+          <w:rtl w:val="0"/>
+        </w:rPr>
+      </w:r>
+    </w:p>
+    <w:p>
+      <w:pPr>
+        <w:ind w:firstLine="0"/>
+        <w:rPr/>
+      </w:pPr>
+      <w:r>
+        <w:rPr>
+          <w:rtl w:val="0"/>
+        </w:rPr>
+      </w:r>
+    </w:p>
+    <w:p>
+      <w:pPr>
+        <w:ind w:firstLine="0"/>
+        <w:rPr/>
+      </w:pPr>
+      <w:r>
+        <w:rPr>
+          <w:rtl w:val="0"/>
+        </w:rPr>
+      </w:r>
+    </w:p>
+    <w:p>
+      <w:pPr>
+        <w:ind w:firstLine="0"/>
+        <w:rPr/>
+      </w:pPr>
+      <w:r>
+        <w:rPr>
+          <w:rtl w:val="0"/>
+        </w:rPr>
+      </w:r>
+    </w:p>
+    <w:p>
+      <w:pPr>
+        <w:ind w:firstLine="0"/>
+        <w:jc w:val="center"/>
+        <w:rPr/>
+      </w:pPr>
+      <w:r>
+        <w:rPr>
+          <w:rtl w:val="0"/>
+        </w:rPr>
+      </w:r>
+    </w:p>
+    <w:p>
+      <w:pPr>
+        <w:ind w:firstLine="0"/>
+        <w:jc w:val="center"/>
+        <w:rPr>
+          <w:sz w:val="18"/>
+          <w:szCs w:val="18"/>
+        </w:rPr>
+      </w:pPr>
+      <w:r>
+        <w:rPr>
+          <w:b w:val="1"/>
+          <w:bCs w:val="1"/>
+          <w:sz w:val="18"/>
+          <w:szCs w:val="18"/>
+          <w:rtl w:val="0"/>
+        </w:rPr>
+        <w:t xml:space="preserve">Fig. 9 </w:t>
+      </w:r>
+      <w:r>
+        <w:rPr>
+          <w:sz w:val="18"/>
+          <w:szCs w:val="18"/>
+          <w:rtl w:val="0"/>
+        </w:rPr>
+        <w:t xml:space="preserve">- UC5 - Ver lista de eventos como organizador</w:t>
+      </w:r>
+      <w:r>
         <w:drawing>
-          <wp:inline distB="114300" distT="114300" distL="114300" distR="114300">
-            <wp:extent cx="4391350" cy="2565400"/>
+          <wp:anchor allowOverlap="1" behindDoc="0" distB="114300" distT="114300" distL="114300" distR="114300" hidden="0" layoutInCell="1" locked="0" relativeHeight="0" simplePos="0">
+            <wp:simplePos x="0" y="0"/>
+            <wp:positionH relativeFrom="column">
+              <wp:posOffset>-938212</wp:posOffset>
+            </wp:positionH>
+            <wp:positionV relativeFrom="paragraph">
+              <wp:posOffset>114300</wp:posOffset>
+            </wp:positionV>
+            <wp:extent cx="6268773" cy="2067242"/>
             <wp:effectExtent b="0" l="0" r="0" t="0"/>
-            <wp:docPr id="5" name="image7.png"/>
+            <wp:wrapSquare wrapText="bothSides" distB="114300" distT="114300" distL="114300" distR="114300"/>
+            <wp:docPr id="9" name="image1.png"/>
             <a:graphic>
               <a:graphicData uri="http://schemas.openxmlformats.org/drawingml/2006/picture">
                 <pic:pic>
                   <pic:nvPicPr>
-                    <pic:cNvPr id="0" name="image7.png"/>
+                    <pic:cNvPr id="0" name="image1.png"/>
                     <pic:cNvPicPr preferRelativeResize="0"/>
                   </pic:nvPicPr>
                   <pic:blipFill>
@@ -2965,7 +3682,7 @@
                   <pic:spPr>
                     <a:xfrm>
                       <a:off x="0" y="0"/>
-                      <a:ext cx="4391350" cy="2565400"/>
+                      <a:ext cx="6268773" cy="2067242"/>
                     </a:xfrm>
                     <a:prstGeom prst="rect"/>
                     <a:ln/>
@@ -2973,50 +3690,360 @@
                 </pic:pic>
               </a:graphicData>
             </a:graphic>
-          </wp:inline>
+          </wp:anchor>
         </w:drawing>
       </w:r>
-      <w:r>
-        <w:rPr>
-          <w:rtl w:val="0"/>
-        </w:rPr>
-        <w:br w:type="textWrapping"/>
-      </w:r>
-      <w:r>
-        <w:rPr>
-          <w:b w:val="1"/>
-          <w:bCs w:val="1"/>
-          <w:rtl w:val="0"/>
-        </w:rPr>
-        <w:t xml:space="preserve">Fig. 9</w:t>
-      </w:r>
-      <w:r>
-        <w:rPr>
-          <w:rtl w:val="0"/>
-        </w:rPr>
-        <w:t xml:space="preserve"> - UC5 - Criar Evento</w:t>
-        <w:br w:type="textWrapping"/>
-        <w:br w:type="textWrapping"/>
-      </w:r>
-    </w:p>
-    <w:p>
-      <w:pPr>
-        <w:ind w:firstLine="0"/>
-        <w:jc w:val="center"/>
-        <w:rPr/>
-      </w:pPr>
-      <w:r>
-        <w:rPr/>
+    </w:p>
+    <w:p>
+      <w:pPr>
+        <w:ind w:firstLine="0"/>
+        <w:jc w:val="center"/>
+        <w:rPr/>
+      </w:pPr>
+      <w:r>
+        <w:rPr>
+          <w:rtl w:val="0"/>
+        </w:rPr>
+      </w:r>
+    </w:p>
+    <w:p>
+      <w:pPr>
+        <w:ind w:firstLine="0"/>
+        <w:jc w:val="center"/>
+        <w:rPr/>
+      </w:pPr>
+      <w:r>
+        <w:rPr>
+          <w:rtl w:val="0"/>
+        </w:rPr>
+        <w:t xml:space="preserve">Este SSD descreve a interação entre o Organizador e o sistema quando é solicitada a visualização da lista de eventos. O Organizador seleciona a opção para ver a lista de eventos através da interface. O sistema processa o pedido, acede à camada de serviço e ao modelo de dados, consultando o contentor de eventos. A lista de eventos é recuperada e devolvida à interface, sendo apresentada ao Organizador com sucesso.</w:t>
+      </w:r>
+    </w:p>
+    <w:p>
+      <w:pPr>
+        <w:ind w:firstLine="0"/>
+        <w:jc w:val="center"/>
+        <w:rPr/>
+      </w:pPr>
+      <w:r>
+        <w:rPr>
+          <w:rtl w:val="0"/>
+        </w:rPr>
+      </w:r>
+    </w:p>
+    <w:p>
+      <w:pPr>
+        <w:ind w:firstLine="0"/>
+        <w:jc w:val="center"/>
+        <w:rPr/>
+      </w:pPr>
+      <w:r>
+        <w:rPr>
+          <w:rtl w:val="0"/>
+        </w:rPr>
+      </w:r>
+    </w:p>
+    <w:p>
+      <w:pPr>
+        <w:ind w:firstLine="0"/>
+        <w:jc w:val="center"/>
+        <w:rPr/>
+      </w:pPr>
+      <w:r>
+        <w:rPr>
+          <w:rtl w:val="0"/>
+        </w:rPr>
+      </w:r>
+    </w:p>
+    <w:p>
+      <w:pPr>
+        <w:ind w:firstLine="0"/>
+        <w:jc w:val="center"/>
+        <w:rPr/>
+      </w:pPr>
+      <w:r>
+        <w:rPr>
+          <w:rtl w:val="0"/>
+        </w:rPr>
+      </w:r>
+    </w:p>
+    <w:p>
+      <w:pPr>
+        <w:ind w:firstLine="0"/>
+        <w:jc w:val="center"/>
+        <w:rPr/>
+      </w:pPr>
+      <w:r>
+        <w:rPr>
+          <w:rtl w:val="0"/>
+        </w:rPr>
+      </w:r>
+    </w:p>
+    <w:p>
+      <w:pPr>
+        <w:ind w:firstLine="0"/>
+        <w:jc w:val="center"/>
+        <w:rPr/>
+      </w:pPr>
+      <w:r>
+        <w:rPr>
+          <w:rtl w:val="0"/>
+        </w:rPr>
+      </w:r>
+    </w:p>
+    <w:p>
+      <w:pPr>
+        <w:ind w:firstLine="0"/>
+        <w:jc w:val="center"/>
+        <w:rPr/>
+      </w:pPr>
+      <w:r>
+        <w:rPr>
+          <w:rtl w:val="0"/>
+        </w:rPr>
+      </w:r>
+    </w:p>
+    <w:p>
+      <w:pPr>
+        <w:ind w:firstLine="0"/>
+        <w:jc w:val="center"/>
+        <w:rPr/>
+      </w:pPr>
+      <w:r>
+        <w:rPr>
+          <w:rtl w:val="0"/>
+        </w:rPr>
+      </w:r>
+    </w:p>
+    <w:p>
+      <w:pPr>
+        <w:ind w:firstLine="0"/>
+        <w:jc w:val="center"/>
+        <w:rPr/>
+      </w:pPr>
+      <w:r>
+        <w:rPr>
+          <w:rtl w:val="0"/>
+        </w:rPr>
+      </w:r>
+    </w:p>
+    <w:p>
+      <w:pPr>
+        <w:ind w:firstLine="0"/>
+        <w:jc w:val="center"/>
+        <w:rPr/>
+      </w:pPr>
+      <w:r>
+        <w:rPr>
+          <w:rtl w:val="0"/>
+        </w:rPr>
+      </w:r>
+    </w:p>
+    <w:p>
+      <w:pPr>
+        <w:ind w:firstLine="0"/>
+        <w:jc w:val="center"/>
+        <w:rPr/>
+      </w:pPr>
+      <w:r>
+        <w:rPr>
+          <w:rtl w:val="0"/>
+        </w:rPr>
+      </w:r>
+    </w:p>
+    <w:p>
+      <w:pPr>
+        <w:ind w:firstLine="0"/>
+        <w:jc w:val="center"/>
+        <w:rPr/>
+      </w:pPr>
+      <w:r>
+        <w:rPr>
+          <w:rtl w:val="0"/>
+        </w:rPr>
+      </w:r>
+    </w:p>
+    <w:p>
+      <w:pPr>
+        <w:ind w:firstLine="0"/>
+        <w:jc w:val="center"/>
+        <w:rPr/>
+      </w:pPr>
+      <w:r>
+        <w:rPr>
+          <w:rtl w:val="0"/>
+        </w:rPr>
+      </w:r>
+    </w:p>
+    <w:p>
+      <w:pPr>
+        <w:ind w:firstLine="0"/>
+        <w:jc w:val="center"/>
+        <w:rPr/>
+      </w:pPr>
+      <w:r>
+        <w:rPr>
+          <w:rtl w:val="0"/>
+        </w:rPr>
+      </w:r>
+    </w:p>
+    <w:p>
+      <w:pPr>
+        <w:ind w:firstLine="0"/>
+        <w:jc w:val="center"/>
+        <w:rPr/>
+      </w:pPr>
+      <w:r>
+        <w:rPr>
+          <w:rtl w:val="0"/>
+        </w:rPr>
+      </w:r>
+    </w:p>
+    <w:p>
+      <w:pPr>
+        <w:ind w:firstLine="0"/>
+        <w:jc w:val="center"/>
+        <w:rPr/>
+      </w:pPr>
+      <w:r>
+        <w:rPr>
+          <w:rtl w:val="0"/>
+        </w:rPr>
+      </w:r>
+    </w:p>
+    <w:p>
+      <w:pPr>
+        <w:ind w:firstLine="0"/>
+        <w:jc w:val="center"/>
+        <w:rPr/>
+      </w:pPr>
+      <w:r>
+        <w:rPr>
+          <w:rtl w:val="0"/>
+        </w:rPr>
+      </w:r>
+    </w:p>
+    <w:p>
+      <w:pPr>
+        <w:ind w:firstLine="0"/>
+        <w:jc w:val="center"/>
+        <w:rPr/>
+      </w:pPr>
+      <w:r>
+        <w:rPr>
+          <w:rtl w:val="0"/>
+        </w:rPr>
+      </w:r>
+    </w:p>
+    <w:p>
+      <w:pPr>
+        <w:ind w:firstLine="0"/>
+        <w:jc w:val="center"/>
+        <w:rPr/>
+      </w:pPr>
+      <w:r>
+        <w:rPr>
+          <w:rtl w:val="0"/>
+        </w:rPr>
+      </w:r>
+    </w:p>
+    <w:p>
+      <w:pPr>
+        <w:ind w:firstLine="0"/>
+        <w:jc w:val="center"/>
+        <w:rPr/>
+      </w:pPr>
+      <w:r>
+        <w:rPr>
+          <w:rtl w:val="0"/>
+        </w:rPr>
+      </w:r>
+    </w:p>
+    <w:p>
+      <w:pPr>
+        <w:ind w:firstLine="0"/>
+        <w:jc w:val="center"/>
+        <w:rPr/>
+      </w:pPr>
+      <w:r>
+        <w:rPr>
+          <w:rtl w:val="0"/>
+        </w:rPr>
+      </w:r>
+    </w:p>
+    <w:p>
+      <w:pPr>
+        <w:ind w:firstLine="0"/>
+        <w:jc w:val="center"/>
+        <w:rPr/>
+      </w:pPr>
+      <w:r>
+        <w:rPr>
+          <w:rtl w:val="0"/>
+        </w:rPr>
+      </w:r>
+    </w:p>
+    <w:p>
+      <w:pPr>
+        <w:ind w:firstLine="0"/>
+        <w:jc w:val="center"/>
+        <w:rPr/>
+      </w:pPr>
+      <w:r>
+        <w:rPr>
+          <w:rtl w:val="0"/>
+        </w:rPr>
+      </w:r>
+    </w:p>
+    <w:p>
+      <w:pPr>
+        <w:ind w:firstLine="0"/>
+        <w:jc w:val="center"/>
+        <w:rPr/>
+      </w:pPr>
+      <w:r>
+        <w:rPr>
+          <w:b w:val="1"/>
+          <w:bCs w:val="1"/>
+          <w:sz w:val="18"/>
+          <w:szCs w:val="18"/>
+          <w:rtl w:val="0"/>
+        </w:rPr>
+        <w:t xml:space="preserve">Fig. 10 </w:t>
+      </w:r>
+      <w:r>
+        <w:rPr>
+          <w:sz w:val="18"/>
+          <w:szCs w:val="18"/>
+          <w:rtl w:val="0"/>
+        </w:rPr>
+        <w:t xml:space="preserve">- UC6 - Ver participantes como utilizador</w:t>
+      </w:r>
+      <w:r>
+        <w:rPr>
+          <w:rtl w:val="0"/>
+        </w:rPr>
+        <w:t xml:space="preserve"> </w:t>
+      </w:r>
+      <w:r>
         <w:drawing>
-          <wp:inline distB="114300" distT="114300" distL="114300" distR="114300">
-            <wp:extent cx="4391350" cy="1511300"/>
+          <wp:anchor allowOverlap="1" behindDoc="0" distB="114300" distT="114300" distL="114300" distR="114300" hidden="0" layoutInCell="1" locked="0" relativeHeight="0" simplePos="0">
+            <wp:simplePos x="0" y="0"/>
+            <wp:positionH relativeFrom="column">
+              <wp:posOffset>-1047586</wp:posOffset>
+            </wp:positionH>
+            <wp:positionV relativeFrom="paragraph">
+              <wp:posOffset>114300</wp:posOffset>
+            </wp:positionV>
+            <wp:extent cx="6483012" cy="2238058"/>
             <wp:effectExtent b="0" l="0" r="0" t="0"/>
-            <wp:docPr id="11" name="image4.png"/>
+            <wp:wrapSquare wrapText="bothSides" distB="114300" distT="114300" distL="114300" distR="114300"/>
+            <wp:docPr id="8" name="image3.png"/>
             <a:graphic>
               <a:graphicData uri="http://schemas.openxmlformats.org/drawingml/2006/picture">
                 <pic:pic>
                   <pic:nvPicPr>
-                    <pic:cNvPr id="0" name="image4.png"/>
+                    <pic:cNvPr id="0" name="image3.png"/>
                     <pic:cNvPicPr preferRelativeResize="0"/>
                   </pic:nvPicPr>
                   <pic:blipFill>
@@ -3029,7 +4056,7 @@
                   <pic:spPr>
                     <a:xfrm>
                       <a:off x="0" y="0"/>
-                      <a:ext cx="4391350" cy="1511300"/>
+                      <a:ext cx="6483012" cy="2238058"/>
                     </a:xfrm>
                     <a:prstGeom prst="rect"/>
                     <a:ln/>
@@ -3037,46 +4064,32 @@
                 </pic:pic>
               </a:graphicData>
             </a:graphic>
-          </wp:inline>
+          </wp:anchor>
         </w:drawing>
       </w:r>
-      <w:r>
-        <w:rPr>
-          <w:rtl w:val="0"/>
-        </w:rPr>
-      </w:r>
-    </w:p>
-    <w:p>
-      <w:pPr>
-        <w:ind w:firstLine="0"/>
-        <w:jc w:val="center"/>
-        <w:rPr/>
-      </w:pPr>
-      <w:r>
-        <w:rPr>
-          <w:b w:val="1"/>
-          <w:bCs w:val="1"/>
-          <w:rtl w:val="0"/>
-        </w:rPr>
-        <w:t xml:space="preserve">Fig. 10</w:t>
-      </w:r>
-      <w:r>
-        <w:rPr>
-          <w:rtl w:val="0"/>
-        </w:rPr>
-        <w:t xml:space="preserve"> - UC6 - Ver Participantes</w:t>
-      </w:r>
-    </w:p>
-    <w:p>
-      <w:pPr>
-        <w:ind w:firstLine="0"/>
-        <w:jc w:val="center"/>
-        <w:rPr/>
-      </w:pPr>
-      <w:r>
-        <w:rPr>
-          <w:rtl w:val="0"/>
-        </w:rPr>
+    </w:p>
+    <w:p>
+      <w:pPr>
+        <w:ind w:firstLine="0"/>
+        <w:jc w:val="center"/>
+        <w:rPr/>
+      </w:pPr>
+      <w:r>
+        <w:rPr>
+          <w:rtl w:val="0"/>
+        </w:rPr>
+      </w:r>
+    </w:p>
+    <w:p>
+      <w:pPr>
+        <w:ind w:firstLine="0"/>
+        <w:rPr/>
+      </w:pPr>
+      <w:r>
+        <w:rPr>
+          <w:rtl w:val="0"/>
+        </w:rPr>
+        <w:t xml:space="preserve">Este SSD descreve a interação entre o Organizador e o sistema quando é solicitada a visualização da lista de participantes. O Organizador seleciona a opção para ver os participantes através da interface. O sistema processa o pedido, acede à camada de serviço e ao modelo de dados, consultando o contentor de artistas/participantes. A lista completa de participantes é recuperada e devolvida à interface, sendo apresentada ao Organizador com sucesso. </w:t>
       </w:r>
     </w:p>
     <w:p>
@@ -3093,23 +4106,51 @@
           <w:between w:space="0" w:sz="0" w:val="nil"/>
         </w:pBdr>
         <w:shd w:fill="auto" w:val="clear"/>
-        <w:spacing w:after="240" w:before="120" w:line="240" w:lineRule="auto"/>
+        <w:spacing w:after="220" w:before="440" w:line="240" w:lineRule="auto"/>
         <w:ind w:left="0" w:right="0" w:firstLine="0"/>
-        <w:jc w:val="both"/>
-        <w:rPr/>
-      </w:pPr>
-      <w:r>
-        <w:rPr/>
+        <w:jc w:val="center"/>
+        <w:rPr>
+          <w:sz w:val="18"/>
+          <w:szCs w:val="18"/>
+        </w:rPr>
+      </w:pPr>
+      <w:r>
+        <w:rPr>
+          <w:b w:val="1"/>
+          <w:bCs w:val="1"/>
+          <w:sz w:val="18"/>
+          <w:szCs w:val="18"/>
+          <w:rtl w:val="0"/>
+        </w:rPr>
+        <w:t xml:space="preserve">Fig. 10 </w:t>
+      </w:r>
+      <w:r>
+        <w:rPr>
+          <w:sz w:val="18"/>
+          <w:szCs w:val="18"/>
+          <w:rtl w:val="0"/>
+        </w:rPr>
+        <w:t xml:space="preserve">- UC7 - Criar Evento</w:t>
+      </w:r>
+      <w:r>
         <w:drawing>
-          <wp:inline distB="114300" distT="114300" distL="114300" distR="114300">
-            <wp:extent cx="4391350" cy="1447800"/>
+          <wp:anchor allowOverlap="1" behindDoc="0" distB="114300" distT="114300" distL="114300" distR="114300" hidden="0" layoutInCell="1" locked="0" relativeHeight="0" simplePos="0">
+            <wp:simplePos x="0" y="0"/>
+            <wp:positionH relativeFrom="column">
+              <wp:posOffset>-1152361</wp:posOffset>
+            </wp:positionH>
+            <wp:positionV relativeFrom="paragraph">
+              <wp:posOffset>114300</wp:posOffset>
+            </wp:positionV>
+            <wp:extent cx="6692198" cy="3915092"/>
             <wp:effectExtent b="0" l="0" r="0" t="0"/>
-            <wp:docPr id="8" name="image3.png"/>
+            <wp:wrapSquare wrapText="bothSides" distB="114300" distT="114300" distL="114300" distR="114300"/>
+            <wp:docPr id="12" name="image5.png"/>
             <a:graphic>
               <a:graphicData uri="http://schemas.openxmlformats.org/drawingml/2006/picture">
                 <pic:pic>
                   <pic:nvPicPr>
-                    <pic:cNvPr id="0" name="image3.png"/>
+                    <pic:cNvPr id="0" name="image5.png"/>
                     <pic:cNvPicPr preferRelativeResize="0"/>
                   </pic:nvPicPr>
                   <pic:blipFill>
@@ -3122,7 +4163,7 @@
                   <pic:spPr>
                     <a:xfrm>
                       <a:off x="0" y="0"/>
-                      <a:ext cx="4391350" cy="1447800"/>
+                      <a:ext cx="6692198" cy="3915092"/>
                     </a:xfrm>
                     <a:prstGeom prst="rect"/>
                     <a:ln/>
@@ -3130,53 +4171,166 @@
                 </pic:pic>
               </a:graphicData>
             </a:graphic>
-          </wp:inline>
+          </wp:anchor>
         </w:drawing>
       </w:r>
-      <w:r>
-        <w:rPr>
-          <w:rtl w:val="0"/>
-        </w:rPr>
-      </w:r>
-    </w:p>
-    <w:p>
-      <w:pPr>
-        <w:ind w:firstLine="0"/>
-        <w:jc w:val="center"/>
-        <w:rPr>
-          <w:b w:val="1"/>
-          <w:bCs w:val="1"/>
-        </w:rPr>
-      </w:pPr>
-      <w:r>
-        <w:rPr>
-          <w:b w:val="1"/>
-          <w:bCs w:val="1"/>
-          <w:rtl w:val="0"/>
-        </w:rPr>
-        <w:t xml:space="preserve">Fig. 11</w:t>
-      </w:r>
-      <w:r>
-        <w:rPr>
-          <w:rtl w:val="0"/>
-        </w:rPr>
-        <w:t xml:space="preserve"> - UC7 - Ver lista de eventos como Organizador</w:t>
-        <w:br w:type="textWrapping"/>
-        <w:br w:type="textWrapping"/>
-        <w:br w:type="textWrapping"/>
-      </w:r>
-      <w:r>
-        <w:rPr/>
+    </w:p>
+    <w:p>
+      <w:pPr>
+        <w:keepNext w:val="1"/>
+        <w:keepLines w:val="1"/>
+        <w:pageBreakBefore w:val="0"/>
+        <w:widowControl w:val="1"/>
+        <w:pBdr>
+          <w:top w:space="0" w:sz="0" w:val="nil"/>
+          <w:left w:space="0" w:sz="0" w:val="nil"/>
+          <w:bottom w:space="0" w:sz="0" w:val="nil"/>
+          <w:right w:space="0" w:sz="0" w:val="nil"/>
+          <w:between w:space="0" w:sz="0" w:val="nil"/>
+        </w:pBdr>
+        <w:shd w:fill="auto" w:val="clear"/>
+        <w:spacing w:after="220" w:before="440" w:line="240" w:lineRule="auto"/>
+        <w:ind w:left="0" w:right="0" w:firstLine="0"/>
+        <w:rPr/>
+      </w:pPr>
+      <w:r>
+        <w:rPr>
+          <w:rtl w:val="0"/>
+        </w:rPr>
+        <w:t xml:space="preserve">Este SSD descreve a interação entre o Organizador e o sistema durante o processo de criação de um novo evento. O Organizador seleciona a opção para criar evento e introduz os dados necessários (nome, tipo, identificador, lotação atual e lotação máxima) através da interface. O sistema recolhe a informação, cria um objeto de transferência (DTO) e encaminha os dados para a camada de serviço. Esta acede ao modelo e ao contentor de eventos, onde é criado e registado um novo evento. Após a criação bem-sucedida, o sistema confirma a operação. </w:t>
+      </w:r>
+    </w:p>
+    <w:p>
+      <w:pPr>
+        <w:keepNext w:val="1"/>
+        <w:keepLines w:val="1"/>
+        <w:pageBreakBefore w:val="0"/>
+        <w:widowControl w:val="1"/>
+        <w:pBdr>
+          <w:top w:space="0" w:sz="0" w:val="nil"/>
+          <w:left w:space="0" w:sz="0" w:val="nil"/>
+          <w:bottom w:space="0" w:sz="0" w:val="nil"/>
+          <w:right w:space="0" w:sz="0" w:val="nil"/>
+          <w:between w:space="0" w:sz="0" w:val="nil"/>
+        </w:pBdr>
+        <w:shd w:fill="auto" w:val="clear"/>
+        <w:spacing w:after="220" w:before="440" w:line="240" w:lineRule="auto"/>
+        <w:ind w:left="0" w:right="0" w:firstLine="0"/>
+        <w:rPr/>
+      </w:pPr>
+      <w:r>
+        <w:rPr>
+          <w:rtl w:val="0"/>
+        </w:rPr>
+      </w:r>
+    </w:p>
+    <w:p>
+      <w:pPr>
+        <w:keepNext w:val="1"/>
+        <w:keepLines w:val="1"/>
+        <w:pageBreakBefore w:val="0"/>
+        <w:widowControl w:val="1"/>
+        <w:pBdr>
+          <w:top w:space="0" w:sz="0" w:val="nil"/>
+          <w:left w:space="0" w:sz="0" w:val="nil"/>
+          <w:bottom w:space="0" w:sz="0" w:val="nil"/>
+          <w:right w:space="0" w:sz="0" w:val="nil"/>
+          <w:between w:space="0" w:sz="0" w:val="nil"/>
+        </w:pBdr>
+        <w:shd w:fill="auto" w:val="clear"/>
+        <w:spacing w:after="220" w:before="440" w:line="240" w:lineRule="auto"/>
+        <w:ind w:left="0" w:right="0" w:firstLine="0"/>
+        <w:rPr/>
+      </w:pPr>
+      <w:r>
+        <w:rPr>
+          <w:rtl w:val="0"/>
+        </w:rPr>
+      </w:r>
+    </w:p>
+    <w:p>
+      <w:pPr>
+        <w:keepNext w:val="1"/>
+        <w:keepLines w:val="1"/>
+        <w:pageBreakBefore w:val="0"/>
+        <w:widowControl w:val="1"/>
+        <w:pBdr>
+          <w:top w:space="0" w:sz="0" w:val="nil"/>
+          <w:left w:space="0" w:sz="0" w:val="nil"/>
+          <w:bottom w:space="0" w:sz="0" w:val="nil"/>
+          <w:right w:space="0" w:sz="0" w:val="nil"/>
+          <w:between w:space="0" w:sz="0" w:val="nil"/>
+        </w:pBdr>
+        <w:shd w:fill="auto" w:val="clear"/>
+        <w:spacing w:after="220" w:before="440" w:line="240" w:lineRule="auto"/>
+        <w:ind w:left="0" w:right="0" w:firstLine="0"/>
+        <w:rPr/>
+      </w:pPr>
+      <w:r>
+        <w:rPr>
+          <w:rtl w:val="0"/>
+        </w:rPr>
+      </w:r>
+    </w:p>
+    <w:p>
+      <w:pPr>
+        <w:keepNext w:val="1"/>
+        <w:keepLines w:val="1"/>
+        <w:pageBreakBefore w:val="0"/>
+        <w:widowControl w:val="1"/>
+        <w:pBdr>
+          <w:top w:space="0" w:sz="0" w:val="nil"/>
+          <w:left w:space="0" w:sz="0" w:val="nil"/>
+          <w:bottom w:space="0" w:sz="0" w:val="nil"/>
+          <w:right w:space="0" w:sz="0" w:val="nil"/>
+          <w:between w:space="0" w:sz="0" w:val="nil"/>
+        </w:pBdr>
+        <w:shd w:fill="auto" w:val="clear"/>
+        <w:spacing w:after="220" w:before="440" w:line="240" w:lineRule="auto"/>
+        <w:ind w:left="0" w:right="0" w:firstLine="0"/>
+        <w:jc w:val="center"/>
+        <w:rPr>
+          <w:sz w:val="18"/>
+          <w:szCs w:val="18"/>
+        </w:rPr>
+      </w:pPr>
+      <w:r>
+        <w:rPr>
+          <w:b w:val="1"/>
+          <w:bCs w:val="1"/>
+          <w:sz w:val="18"/>
+          <w:szCs w:val="18"/>
+          <w:rtl w:val="0"/>
+        </w:rPr>
+        <w:t xml:space="preserve">Fig. 11 </w:t>
+      </w:r>
+      <w:r>
+        <w:rPr>
+          <w:sz w:val="18"/>
+          <w:szCs w:val="18"/>
+          <w:rtl w:val="0"/>
+        </w:rPr>
+        <w:t xml:space="preserve">- UC8 - Editar Evento</w:t>
+      </w:r>
+      <w:r>
         <w:drawing>
-          <wp:inline distB="114300" distT="114300" distL="114300" distR="114300">
-            <wp:extent cx="4391350" cy="1917700"/>
+          <wp:anchor allowOverlap="1" behindDoc="0" distB="114300" distT="114300" distL="114300" distR="114300" hidden="0" layoutInCell="1" locked="0" relativeHeight="0" simplePos="0">
+            <wp:simplePos x="0" y="0"/>
+            <wp:positionH relativeFrom="column">
+              <wp:posOffset>-595149</wp:posOffset>
+            </wp:positionH>
+            <wp:positionV relativeFrom="paragraph">
+              <wp:posOffset>114300</wp:posOffset>
+            </wp:positionV>
+            <wp:extent cx="5583103" cy="4733925"/>
             <wp:effectExtent b="0" l="0" r="0" t="0"/>
-            <wp:docPr id="7" name="image10.png"/>
+            <wp:wrapSquare wrapText="bothSides" distB="114300" distT="114300" distL="114300" distR="114300"/>
+            <wp:docPr id="6" name="image2.png"/>
             <a:graphic>
               <a:graphicData uri="http://schemas.openxmlformats.org/drawingml/2006/picture">
                 <pic:pic>
                   <pic:nvPicPr>
-                    <pic:cNvPr id="0" name="image10.png"/>
+                    <pic:cNvPr id="0" name="image2.png"/>
                     <pic:cNvPicPr preferRelativeResize="0"/>
                   </pic:nvPicPr>
                   <pic:blipFill>
@@ -3189,7 +4343,7 @@
                   <pic:spPr>
                     <a:xfrm>
                       <a:off x="0" y="0"/>
-                      <a:ext cx="4391350" cy="1917700"/>
+                      <a:ext cx="5583103" cy="4733925"/>
                     </a:xfrm>
                     <a:prstGeom prst="rect"/>
                     <a:ln/>
@@ -3197,42 +4351,116 @@
                 </pic:pic>
               </a:graphicData>
             </a:graphic>
-          </wp:inline>
+          </wp:anchor>
         </w:drawing>
       </w:r>
-      <w:r>
-        <w:rPr>
-          <w:rtl w:val="0"/>
-        </w:rPr>
-        <w:br w:type="textWrapping"/>
-      </w:r>
-      <w:r>
-        <w:rPr>
-          <w:b w:val="1"/>
-          <w:bCs w:val="1"/>
-          <w:rtl w:val="0"/>
-        </w:rPr>
-        <w:t xml:space="preserve">Fig. 12</w:t>
-      </w:r>
-      <w:r>
-        <w:rPr>
-          <w:rtl w:val="0"/>
-        </w:rPr>
-        <w:t xml:space="preserve"> - UC8 - Registo de Organizador</w:t>
-      </w:r>
-      <w:r>
-        <w:rPr>
-          <w:b w:val="1"/>
-          <w:bCs w:val="1"/>
-          <w:rtl w:val="0"/>
-        </w:rPr>
-        <w:br w:type="textWrapping"/>
-        <w:br w:type="textWrapping"/>
-        <w:br w:type="textWrapping"/>
-        <w:br w:type="textWrapping"/>
-        <w:br w:type="textWrapping"/>
-        <w:br w:type="textWrapping"/>
-        <w:br w:type="textWrapping"/>
+    </w:p>
+    <w:p>
+      <w:pPr>
+        <w:keepNext w:val="1"/>
+        <w:keepLines w:val="1"/>
+        <w:pageBreakBefore w:val="0"/>
+        <w:widowControl w:val="1"/>
+        <w:pBdr>
+          <w:top w:space="0" w:sz="0" w:val="nil"/>
+          <w:left w:space="0" w:sz="0" w:val="nil"/>
+          <w:bottom w:space="0" w:sz="0" w:val="nil"/>
+          <w:right w:space="0" w:sz="0" w:val="nil"/>
+          <w:between w:space="0" w:sz="0" w:val="nil"/>
+        </w:pBdr>
+        <w:shd w:fill="auto" w:val="clear"/>
+        <w:spacing w:after="220" w:before="440" w:line="240" w:lineRule="auto"/>
+        <w:ind w:left="0" w:right="0" w:firstLine="0"/>
+        <w:rPr/>
+      </w:pPr>
+      <w:r>
+        <w:rPr>
+          <w:rtl w:val="0"/>
+        </w:rPr>
+        <w:t xml:space="preserve">Este SSD descreve a interação entre o Organizador e o sistema durante o processo de edição de um evento existente. O Organizador solicita a lista de eventos, seleciona o evento que pretende editar e visualiza os seus detalhes. Em seguida, escolhe a opção de edição e introduz as alterações desejadas através da interface. O sistema processa o pedido, acede ao modelo e ao contentor de eventos, atualiza a informação do evento selecionado e guarda as alterações. Após a atualização bem-sucedida, o sistema confirma a edição do evento. </w:t>
+      </w:r>
+    </w:p>
+    <w:p>
+      <w:pPr>
+        <w:keepNext w:val="1"/>
+        <w:keepLines w:val="1"/>
+        <w:pageBreakBefore w:val="0"/>
+        <w:widowControl w:val="1"/>
+        <w:pBdr>
+          <w:top w:space="0" w:sz="0" w:val="nil"/>
+          <w:left w:space="0" w:sz="0" w:val="nil"/>
+          <w:bottom w:space="0" w:sz="0" w:val="nil"/>
+          <w:right w:space="0" w:sz="0" w:val="nil"/>
+          <w:between w:space="0" w:sz="0" w:val="nil"/>
+        </w:pBdr>
+        <w:shd w:fill="auto" w:val="clear"/>
+        <w:spacing w:after="220" w:before="440" w:line="240" w:lineRule="auto"/>
+        <w:ind w:left="0" w:right="0" w:firstLine="0"/>
+        <w:rPr/>
+      </w:pPr>
+      <w:r>
+        <w:rPr>
+          <w:rtl w:val="0"/>
+        </w:rPr>
+      </w:r>
+    </w:p>
+    <w:p>
+      <w:pPr>
+        <w:keepNext w:val="1"/>
+        <w:keepLines w:val="1"/>
+        <w:pageBreakBefore w:val="0"/>
+        <w:widowControl w:val="1"/>
+        <w:pBdr>
+          <w:top w:space="0" w:sz="0" w:val="nil"/>
+          <w:left w:space="0" w:sz="0" w:val="nil"/>
+          <w:bottom w:space="0" w:sz="0" w:val="nil"/>
+          <w:right w:space="0" w:sz="0" w:val="nil"/>
+          <w:between w:space="0" w:sz="0" w:val="nil"/>
+        </w:pBdr>
+        <w:shd w:fill="auto" w:val="clear"/>
+        <w:spacing w:after="220" w:before="440" w:line="240" w:lineRule="auto"/>
+        <w:ind w:left="0" w:right="0" w:firstLine="0"/>
+        <w:rPr>
+          <w:b w:val="1"/>
+          <w:bCs w:val="1"/>
+          <w:sz w:val="22"/>
+          <w:szCs w:val="22"/>
+        </w:rPr>
+      </w:pPr>
+      <w:r>
+        <w:rPr>
+          <w:b w:val="1"/>
+          <w:bCs w:val="1"/>
+          <w:sz w:val="22"/>
+          <w:szCs w:val="22"/>
+          <w:rtl w:val="0"/>
+        </w:rPr>
+        <w:t xml:space="preserve">7 Interface de Utilizador</w:t>
+      </w:r>
+    </w:p>
+    <w:p>
+      <w:pPr>
+        <w:keepNext w:val="1"/>
+        <w:keepLines w:val="1"/>
+        <w:pageBreakBefore w:val="0"/>
+        <w:widowControl w:val="1"/>
+        <w:pBdr>
+          <w:top w:space="0" w:sz="0" w:val="nil"/>
+          <w:left w:space="0" w:sz="0" w:val="nil"/>
+          <w:bottom w:space="0" w:sz="0" w:val="nil"/>
+          <w:right w:space="0" w:sz="0" w:val="nil"/>
+          <w:between w:space="0" w:sz="0" w:val="nil"/>
+        </w:pBdr>
+        <w:shd w:fill="auto" w:val="clear"/>
+        <w:spacing w:after="220" w:before="440" w:line="240" w:lineRule="auto"/>
+        <w:ind w:left="0" w:right="0" w:firstLine="0"/>
+        <w:rPr/>
+      </w:pPr>
+      <w:r>
+        <w:rPr>
+          <w:rtl w:val="0"/>
+        </w:rPr>
+        <w:t xml:space="preserve">A interface de utilizador da aplicação foi concebida para permitir uma interação simples, clara e intuitiva entre o utilizador e o sistema de gestão de eventos. Baseia-se num conjunto de menus textuais que orientam o utilizador ao longo das diferentes funcionalidades disponíveis, de acordo com o seu perfil (Cliente ou Organizador). </w:t>
       </w:r>
     </w:p>
     <w:p>
@@ -3253,87 +4481,25 @@
         <w:ind w:left="0" w:right="0" w:firstLine="0"/>
         <w:jc w:val="both"/>
         <w:rPr>
-          <w:rFonts w:ascii="Times" w:cs="Times" w:eastAsia="Times" w:hAnsi="Times"/>
-          <w:b w:val="1"/>
-          <w:bCs w:val="1"/>
-          <w:i w:val="0"/>
-          <w:iCs w:val="0"/>
-          <w:smallCaps w:val="0"/>
-          <w:strike w:val="0"/>
-          <w:color w:val="000000"/>
-          <w:sz w:val="20"/>
-          <w:szCs w:val="20"/>
-          <w:u w:val="none"/>
-          <w:shd w:fill="auto" w:val="clear"/>
-          <w:vertAlign w:val="baseline"/>
-        </w:rPr>
-      </w:pPr>
-      <w:r>
-        <w:rPr>
-          <w:b w:val="1"/>
-          <w:bCs w:val="1"/>
-          <w:rtl w:val="0"/>
-        </w:rPr>
-        <w:br w:type="textWrapping"/>
-        <w:t xml:space="preserve">7 Interface</w:t>
-      </w:r>
-      <w:r>
-        <w:rPr>
-          <w:rtl w:val="0"/>
-        </w:rPr>
-      </w:r>
-    </w:p>
-    <w:p>
-      <w:pPr>
-        <w:keepNext w:val="0"/>
-        <w:keepLines w:val="0"/>
-        <w:pageBreakBefore w:val="0"/>
-        <w:widowControl w:val="1"/>
-        <w:pBdr>
-          <w:top w:space="0" w:sz="0" w:val="nil"/>
-          <w:left w:space="0" w:sz="0" w:val="nil"/>
-          <w:bottom w:space="0" w:sz="0" w:val="nil"/>
-          <w:right w:space="0" w:sz="0" w:val="nil"/>
-          <w:between w:space="0" w:sz="0" w:val="nil"/>
-        </w:pBdr>
-        <w:shd w:fill="auto" w:val="clear"/>
-        <w:spacing w:after="0" w:before="0" w:line="240" w:lineRule="auto"/>
-        <w:ind w:left="0" w:right="0" w:firstLine="0"/>
-        <w:jc w:val="both"/>
-        <w:rPr>
-          <w:rFonts w:ascii="Times" w:cs="Times" w:eastAsia="Times" w:hAnsi="Times"/>
-          <w:b w:val="0"/>
-          <w:bCs w:val="0"/>
-          <w:i w:val="0"/>
-          <w:iCs w:val="0"/>
-          <w:smallCaps w:val="0"/>
-          <w:strike w:val="0"/>
-          <w:color w:val="000000"/>
-          <w:sz w:val="20"/>
-          <w:szCs w:val="20"/>
-          <w:u w:val="none"/>
-          <w:shd w:fill="auto" w:val="clear"/>
-          <w:vertAlign w:val="baseline"/>
-        </w:rPr>
-      </w:pPr>
-      <w:r>
-        <w:rPr>
-          <w:rtl w:val="0"/>
-        </w:rPr>
-        <w:t xml:space="preserve">Nesta etapa, está apresentada a interface com que o utilizador interage.</w:t>
-      </w:r>
-      <w:r>
-        <w:rPr/>
+          <w:b w:val="1"/>
+          <w:bCs w:val="1"/>
+        </w:rPr>
+      </w:pPr>
+      <w:r>
+        <w:rPr>
+          <w:b w:val="1"/>
+          <w:bCs w:val="1"/>
+        </w:rPr>
         <w:drawing>
           <wp:inline distB="114300" distT="114300" distL="114300" distR="114300">
             <wp:extent cx="4391350" cy="4330700"/>
             <wp:effectExtent b="0" l="0" r="0" t="0"/>
-            <wp:docPr id="3" name="image5.png"/>
+            <wp:docPr id="5" name="image8.png"/>
             <a:graphic>
               <a:graphicData uri="http://schemas.openxmlformats.org/drawingml/2006/picture">
                 <pic:pic>
                   <pic:nvPicPr>
-                    <pic:cNvPr id="0" name="image5.png"/>
+                    <pic:cNvPr id="0" name="image8.png"/>
                     <pic:cNvPicPr preferRelativeResize="0"/>
                   </pic:nvPicPr>
                   <pic:blipFill>
@@ -3379,6 +4545,52 @@
         <w:shd w:fill="auto" w:val="clear"/>
         <w:spacing w:after="220" w:before="440" w:line="240" w:lineRule="auto"/>
         <w:ind w:left="0" w:right="0" w:firstLine="0"/>
+        <w:jc w:val="center"/>
+        <w:rPr>
+          <w:sz w:val="16"/>
+          <w:szCs w:val="16"/>
+        </w:rPr>
+      </w:pPr>
+      <w:r>
+        <w:rPr>
+          <w:b w:val="1"/>
+          <w:bCs w:val="1"/>
+          <w:sz w:val="18"/>
+          <w:szCs w:val="18"/>
+          <w:rtl w:val="0"/>
+        </w:rPr>
+        <w:t xml:space="preserve">Fig. 11 - </w:t>
+      </w:r>
+      <w:r>
+        <w:rPr>
+          <w:sz w:val="18"/>
+          <w:szCs w:val="18"/>
+          <w:rtl w:val="0"/>
+        </w:rPr>
+        <w:t xml:space="preserve">Interface de Utilizador</w:t>
+      </w:r>
+      <w:r>
+        <w:rPr>
+          <w:rtl w:val="0"/>
+        </w:rPr>
+      </w:r>
+    </w:p>
+    <w:p>
+      <w:pPr>
+        <w:keepNext w:val="1"/>
+        <w:keepLines w:val="1"/>
+        <w:pageBreakBefore w:val="0"/>
+        <w:widowControl w:val="1"/>
+        <w:pBdr>
+          <w:top w:space="0" w:sz="0" w:val="nil"/>
+          <w:left w:space="0" w:sz="0" w:val="nil"/>
+          <w:bottom w:space="0" w:sz="0" w:val="nil"/>
+          <w:right w:space="0" w:sz="0" w:val="nil"/>
+          <w:between w:space="0" w:sz="0" w:val="nil"/>
+        </w:pBdr>
+        <w:shd w:fill="auto" w:val="clear"/>
+        <w:spacing w:after="220" w:before="440" w:line="240" w:lineRule="auto"/>
+        <w:ind w:left="0" w:right="0" w:firstLine="0"/>
         <w:jc w:val="both"/>
         <w:rPr>
           <w:b w:val="1"/>
@@ -3391,7 +4603,6 @@
           <w:bCs w:val="1"/>
           <w:rtl w:val="0"/>
         </w:rPr>
-        <w:br w:type="textWrapping"/>
         <w:br w:type="textWrapping"/>
       </w:r>
     </w:p>
@@ -3421,8 +4632,8 @@
           <w:smallCaps w:val="0"/>
           <w:strike w:val="0"/>
           <w:color w:val="000000"/>
-          <w:sz w:val="20"/>
-          <w:szCs w:val="20"/>
+          <w:sz w:val="24"/>
+          <w:szCs w:val="24"/>
           <w:u w:val="none"/>
           <w:shd w:fill="auto" w:val="clear"/>
           <w:vertAlign w:val="baseline"/>
@@ -3435,9 +4646,15 @@
           <w:rtl w:val="0"/>
         </w:rPr>
         <w:br w:type="textWrapping"/>
-        <w:br w:type="textWrapping"/>
-        <w:br w:type="textWrapping"/>
-        <w:br w:type="textWrapping"/>
+      </w:r>
+      <w:r>
+        <w:rPr>
+          <w:b w:val="1"/>
+          <w:bCs w:val="1"/>
+          <w:sz w:val="24"/>
+          <w:szCs w:val="24"/>
+          <w:rtl w:val="0"/>
+        </w:rPr>
         <w:t xml:space="preserve">8 Conclusão</w:t>
       </w:r>
       <w:r>
@@ -3474,8 +4691,9 @@
       </w:r>
     </w:p>
     <w:sectPr>
-      <w:headerReference r:id="rId19" w:type="even"/>
-      <w:footerReference r:id="rId20" w:type="even"/>
+      <w:headerReference r:id="rId19" w:type="first"/>
+      <w:headerReference r:id="rId20" w:type="even"/>
+      <w:footerReference r:id="rId21" w:type="even"/>
       <w:pgSz w:h="16840" w:w="11907" w:orient="portrait"/>
       <w:pgMar w:bottom="2948" w:top="2948" w:left="2495" w:right="2495" w:header="0" w:footer="0"/>
       <w:pgNumType w:start="1"/>
@@ -3504,8 +4722,21 @@
 <w:hdr xmlns:mc="http://schemas.openxmlformats.org/markup-compatibility/2006" xmlns:o="urn:schemas-microsoft-com:office:office" xmlns:r="http://schemas.openxmlformats.org/officeDocument/2006/relationships" xmlns:m="http://schemas.openxmlformats.org/officeDocument/2006/math" xmlns:v="urn:schemas-microsoft-com:vml" xmlns:wp="http://schemas.openxmlformats.org/drawingml/2006/wordprocessingDrawing" xmlns:w10="urn:schemas-microsoft-com:office:word" xmlns:w="http://schemas.openxmlformats.org/wordprocessingml/2006/main" xmlns:wne="http://schemas.microsoft.com/office/word/2006/wordml" xmlns:sl="http://schemas.openxmlformats.org/schemaLibrary/2006/main" xmlns:a="http://schemas.openxmlformats.org/drawingml/2006/main" xmlns:pic="http://schemas.openxmlformats.org/drawingml/2006/picture" xmlns:c="http://schemas.openxmlformats.org/drawingml/2006/chart" xmlns:lc="http://schemas.openxmlformats.org/drawingml/2006/lockedCanvas" xmlns:dgm="http://schemas.openxmlformats.org/drawingml/2006/diagram" xmlns:wps="http://schemas.microsoft.com/office/word/2010/wordprocessingShape" xmlns:wpg="http://schemas.microsoft.com/office/word/2010/wordprocessingGroup" xmlns:w14="http://schemas.microsoft.com/office/word/2010/wordml" xmlns:w15="http://schemas.microsoft.com/office/word/2012/wordml" xmlns:w16="http://schemas.microsoft.com/office/word/2018/wordml" xmlns:w16cex="http://schemas.microsoft.com/office/word/2018/wordml/cex" xmlns:w16cid="http://schemas.microsoft.com/office/word/2016/wordml/cid" xmlns="http://schemas.microsoft.com/office/tasks/2019/documenttasks" xmlns:cr="http://schemas.microsoft.com/office/comments/2020/reactions">
   <w:p>
     <w:pPr>
-      <w:ind w:firstLine="0"/>
-      <w:jc w:val="center"/>
+      <w:rPr/>
+    </w:pPr>
+    <w:r>
+      <w:rPr>
+        <w:rtl w:val="0"/>
+      </w:rPr>
+    </w:r>
+  </w:p>
+</w:hdr>
+</file>
+
+<file path=word/header2.xml><?xml version="1.0" encoding="utf-8"?>
+<w:hdr xmlns:mc="http://schemas.openxmlformats.org/markup-compatibility/2006" xmlns:o="urn:schemas-microsoft-com:office:office" xmlns:r="http://schemas.openxmlformats.org/officeDocument/2006/relationships" xmlns:m="http://schemas.openxmlformats.org/officeDocument/2006/math" xmlns:v="urn:schemas-microsoft-com:vml" xmlns:wp="http://schemas.openxmlformats.org/drawingml/2006/wordprocessingDrawing" xmlns:w10="urn:schemas-microsoft-com:office:word" xmlns:w="http://schemas.openxmlformats.org/wordprocessingml/2006/main" xmlns:wne="http://schemas.microsoft.com/office/word/2006/wordml" xmlns:sl="http://schemas.openxmlformats.org/schemaLibrary/2006/main" xmlns:a="http://schemas.openxmlformats.org/drawingml/2006/main" xmlns:pic="http://schemas.openxmlformats.org/drawingml/2006/picture" xmlns:c="http://schemas.openxmlformats.org/drawingml/2006/chart" xmlns:lc="http://schemas.openxmlformats.org/drawingml/2006/lockedCanvas" xmlns:dgm="http://schemas.openxmlformats.org/drawingml/2006/diagram" xmlns:wps="http://schemas.microsoft.com/office/word/2010/wordprocessingShape" xmlns:wpg="http://schemas.microsoft.com/office/word/2010/wordprocessingGroup" xmlns:w14="http://schemas.microsoft.com/office/word/2010/wordml" xmlns:w15="http://schemas.microsoft.com/office/word/2012/wordml" xmlns:w16="http://schemas.microsoft.com/office/word/2018/wordml" xmlns:w16cex="http://schemas.microsoft.com/office/word/2018/wordml/cex" xmlns:w16cid="http://schemas.microsoft.com/office/word/2016/wordml/cid" xmlns="http://schemas.microsoft.com/office/tasks/2019/documenttasks" xmlns:cr="http://schemas.microsoft.com/office/comments/2020/reactions">
+  <w:p>
+    <w:pPr>
       <w:rPr/>
     </w:pPr>
     <w:r>

</xml_diff>